<commit_message>
Publish provisional book catalog, rights ledger and five-role editorial review
Co-authored-by: Leonidy431 <12783917+Leonidy431@users.noreply.github.com>
</commit_message>
<xml_diff>
--- a/deliverables/third-attempt/common-prayers-three-columns.docx
+++ b/deliverables/third-attempt/common-prayers-three-columns.docx
@@ -9,8 +9,8 @@
       <w:r>
         <w:rPr>
           <w:rFonts w:ascii="DejaVu Sans" w:hAnsi="DejaVu Sans" w:eastAsia="DejaVu Sans" w:cs="DejaVu Sans"/>
-          <w:lang w:val="ru-RU"/>
-          <w:sz w:val="22"/>
+          <w:sz w:val="22"/>
+          <w:lang w:val="ru-RU"/>
         </w:rPr>
         <w:t xml:space="preserve">Гаврилов Леонид Геннадьевич</w:t>
       </w:r>
@@ -22,8 +22,8 @@
       <w:r>
         <w:rPr>
           <w:rFonts w:ascii="DejaVu Sans" w:hAnsi="DejaVu Sans" w:eastAsia="DejaVu Sans" w:cs="DejaVu Sans"/>
-          <w:lang w:val="ru-RU"/>
-          <w:sz w:val="22"/>
+          <w:sz w:val="22"/>
+          <w:lang w:val="ru-RU"/>
         </w:rPr>
         <w:t xml:space="preserve">Основные молитвы и поведение в храме</w:t>
       </w:r>
@@ -35,8 +35,8 @@
       <w:r>
         <w:rPr>
           <w:rFonts w:ascii="DejaVu Sans" w:hAnsi="DejaVu Sans" w:eastAsia="DejaVu Sans" w:cs="DejaVu Sans"/>
-          <w:lang w:val="ru-RU"/>
-          <w:sz w:val="22"/>
+          <w:sz w:val="22"/>
+          <w:lang w:val="ru-RU"/>
         </w:rPr>
         <w:t xml:space="preserve">Кипр, Армения, Болгария: сравнительное исследование и трёхъязычная памятка</w:t>
       </w:r>
@@ -48,8 +48,8 @@
       <w:r>
         <w:rPr>
           <w:rFonts w:ascii="DejaVu Sans" w:hAnsi="DejaVu Sans" w:eastAsia="DejaVu Sans" w:cs="DejaVu Sans"/>
-          <w:lang w:val="ru-RU"/>
-          <w:sz w:val="22"/>
+          <w:sz w:val="22"/>
+          <w:lang w:val="ru-RU"/>
         </w:rPr>
         <w:t xml:space="preserve">Монография</w:t>
       </w:r>
@@ -61,8 +61,8 @@
       <w:r>
         <w:rPr>
           <w:rFonts w:ascii="DejaVu Sans" w:hAnsi="DejaVu Sans" w:eastAsia="DejaVu Sans" w:cs="DejaVu Sans"/>
-          <w:lang w:val="ru-RU"/>
-          <w:sz w:val="22"/>
+          <w:sz w:val="22"/>
+          <w:lang w:val="ru-RU"/>
         </w:rPr>
         <w:t xml:space="preserve">2026</w:t>
       </w:r>
@@ -74,8 +74,8 @@
       <w:r>
         <w:rPr>
           <w:rFonts w:ascii="DejaVu Sans" w:hAnsi="DejaVu Sans" w:eastAsia="DejaVu Sans" w:cs="DejaVu Sans"/>
-          <w:lang w:val="ru-RU"/>
-          <w:sz w:val="22"/>
+          <w:sz w:val="22"/>
+          <w:lang w:val="ru-RU"/>
         </w:rPr>
         <w:t xml:space="preserve">Рабочая исследовательская редакция</w:t>
       </w:r>
@@ -87,8 +87,8 @@
       <w:r>
         <w:rPr>
           <w:rFonts w:ascii="DejaVu Sans" w:hAnsi="DejaVu Sans" w:eastAsia="DejaVu Sans" w:cs="DejaVu Sans"/>
-          <w:lang w:val="ru-RU"/>
-          <w:sz w:val="22"/>
+          <w:sz w:val="22"/>
+          <w:lang w:val="ru-RU"/>
         </w:rPr>
         <w:t xml:space="preserve">Редакционный макет незавершённой монографии. Не готовая книга, не проверенная молитвенная памятка и не церковно одобренное издание.</w:t>
       </w:r>
@@ -100,71 +100,220 @@
     </w:p>
     <w:p>
       <w:pPr>
-        <w:spacing w:after="120"/>
         <w:keepNext/>
+        <w:spacing w:after="120"/>
         <w:outlineLvl w:val="0"/>
       </w:pPr>
       <w:r>
         <w:rPr>
           <w:rFonts w:ascii="DejaVu Sans" w:hAnsi="DejaVu Sans" w:eastAsia="DejaVu Sans" w:cs="DejaVu Sans"/>
-          <w:lang w:val="ru-RU"/>
+          <w:b/>
           <w:sz w:val="28"/>
+          <w:lang w:val="ru-RU"/>
+        </w:rPr>
+        <w:t xml:space="preserve">Аннотация</w:t>
+      </w:r>
+    </w:p>
+    <w:p>
+      <w:pPr>
+        <w:spacing w:after="120"/>
+      </w:pPr>
+      <w:r>
+        <w:rPr>
+          <w:rFonts w:ascii="DejaVu Sans" w:hAnsi="DejaVu Sans" w:eastAsia="DejaVu Sans" w:cs="DejaVu Sans"/>
+          <w:sz w:val="22"/>
+          <w:lang w:val="ru-RU"/>
+        </w:rPr>
+        <w:t xml:space="preserve">Работа поставлена как сравнение основных молитв и поведения посетителя храма в трёх традициях. Эта редакция сохраняет исследовательский вопрос, границы доказательств и параллельные составительские вопросы на трёх языках. Подтверждённое пересечение пока не установлено; отсутствие проверки не означает отсутствия общей практики.</w:t>
+      </w:r>
+    </w:p>
+    <w:p>
+      <w:pPr>
+        <w:keepNext/>
+        <w:spacing w:after="120"/>
+        <w:outlineLvl w:val="0"/>
+      </w:pPr>
+      <w:r>
+        <w:rPr>
+          <w:rFonts w:ascii="DejaVu Sans" w:hAnsi="DejaVu Sans" w:eastAsia="DejaVu Sans" w:cs="DejaVu Sans"/>
           <w:b/>
-        </w:rPr>
-        <w:t xml:space="preserve">Аннотация</w:t>
-      </w:r>
-    </w:p>
-    <w:p>
-      <w:pPr>
-        <w:spacing w:after="120"/>
-      </w:pPr>
-      <w:r>
-        <w:rPr>
-          <w:rFonts w:ascii="DejaVu Sans" w:hAnsi="DejaVu Sans" w:eastAsia="DejaVu Sans" w:cs="DejaVu Sans"/>
-          <w:lang w:val="ru-RU"/>
-          <w:sz w:val="22"/>
-        </w:rPr>
-        <w:t xml:space="preserve">Работа поставлена как сравнение основных молитв и поведения посетителя храма в трёх традициях. Эта редакция сохраняет исследовательский вопрос, границы доказательств и параллельные составительские вопросы на трёх языках. Подтверждённое пересечение пока не установлено; отсутствие проверки не означает отсутствия общей практики.</w:t>
-      </w:r>
-    </w:p>
-    <w:p>
-      <w:pPr>
-        <w:spacing w:after="120"/>
+          <w:sz w:val="28"/>
+          <w:lang w:val="ru-RU"/>
+        </w:rPr>
+        <w:t xml:space="preserve">Содержание</w:t>
+      </w:r>
+    </w:p>
+    <w:p>
+      <w:pPr>
+        <w:spacing w:after="120"/>
+      </w:pPr>
+      <w:r>
+        <w:rPr>
+          <w:rFonts w:ascii="DejaVu Sans" w:hAnsi="DejaVu Sans" w:eastAsia="DejaVu Sans" w:cs="DejaVu Sans"/>
+          <w:sz w:val="22"/>
+          <w:lang w:val="ru-RU"/>
+        </w:rPr>
+        <w:t xml:space="preserve">1. Введение: вопросы посетителя</w:t>
+      </w:r>
+    </w:p>
+    <w:p>
+      <w:pPr>
+        <w:spacing w:after="120"/>
+      </w:pPr>
+      <w:r>
+        <w:rPr>
+          <w:rFonts w:ascii="DejaVu Sans" w:hAnsi="DejaVu Sans" w:eastAsia="DejaVu Sans" w:cs="DejaVu Sans"/>
+          <w:sz w:val="22"/>
+          <w:lang w:val="ru-RU"/>
+        </w:rPr>
+        <w:t xml:space="preserve">2. Границы сравнения и метод</w:t>
+      </w:r>
+    </w:p>
+    <w:p>
+      <w:pPr>
+        <w:spacing w:after="120"/>
+      </w:pPr>
+      <w:r>
+        <w:rPr>
+          <w:rFonts w:ascii="DejaVu Sans" w:hAnsi="DejaVu Sans" w:eastAsia="DejaVu Sans" w:cs="DejaVu Sans"/>
+          <w:sz w:val="22"/>
+          <w:lang w:val="ru-RU"/>
+        </w:rPr>
+        <w:t xml:space="preserve">3. Подтверждённый молитвенный минимум</w:t>
+      </w:r>
+    </w:p>
+    <w:p>
+      <w:pPr>
+        <w:spacing w:after="120"/>
+      </w:pPr>
+      <w:r>
+        <w:rPr>
+          <w:rFonts w:ascii="DejaVu Sans" w:hAnsi="DejaVu Sans" w:eastAsia="DejaVu Sans" w:cs="DejaVu Sans"/>
+          <w:sz w:val="22"/>
+          <w:lang w:val="ru-RU"/>
+        </w:rPr>
+        <w:t xml:space="preserve">4. Подтверждённые общие обычаи</w:t>
+      </w:r>
+    </w:p>
+    <w:p>
+      <w:pPr>
+        <w:spacing w:after="120"/>
+      </w:pPr>
+      <w:r>
+        <w:rPr>
+          <w:rFonts w:ascii="DejaVu Sans" w:hAnsi="DejaVu Sans" w:eastAsia="DejaVu Sans" w:cs="DejaVu Sans"/>
+          <w:sz w:val="22"/>
+          <w:lang w:val="ru-RU"/>
+        </w:rPr>
+        <w:t xml:space="preserve">5. Параллельные вопросы посетителя: редакционный макет</w:t>
+      </w:r>
+    </w:p>
+    <w:p>
+      <w:pPr>
+        <w:spacing w:after="120"/>
+      </w:pPr>
+      <w:r>
+        <w:rPr>
+          <w:rFonts w:ascii="DejaVu Sans" w:hAnsi="DejaVu Sans" w:eastAsia="DejaVu Sans" w:cs="DejaVu Sans"/>
+          <w:sz w:val="22"/>
+          <w:lang w:val="ru-RU"/>
+        </w:rPr>
+        <w:t xml:space="preserve">6. Комментарии к различиям</w:t>
+      </w:r>
+    </w:p>
+    <w:p>
+      <w:pPr>
+        <w:spacing w:after="120"/>
+      </w:pPr>
+      <w:r>
+        <w:rPr>
+          <w:rFonts w:ascii="DejaVu Sans" w:hAnsi="DejaVu Sans" w:eastAsia="DejaVu Sans" w:cs="DejaVu Sans"/>
+          <w:sz w:val="22"/>
+          <w:lang w:val="ru-RU"/>
+        </w:rPr>
+        <w:t xml:space="preserve">7. Источники и очередь проверки</w:t>
+      </w:r>
+    </w:p>
+    <w:p>
+      <w:pPr>
+        <w:spacing w:after="120"/>
+      </w:pPr>
+      <w:r>
+        <w:rPr>
+          <w:rFonts w:ascii="DejaVu Sans" w:hAnsi="DejaVu Sans" w:eastAsia="DejaVu Sans" w:cs="DejaVu Sans"/>
+          <w:sz w:val="22"/>
+          <w:lang w:val="ru-RU"/>
+        </w:rPr>
+        <w:t xml:space="preserve">8. Ограничения проверки</w:t>
+      </w:r>
+    </w:p>
+    <w:p>
+      <w:pPr>
         <w:keepNext/>
+        <w:spacing w:after="120"/>
         <w:outlineLvl w:val="0"/>
       </w:pPr>
       <w:r>
         <w:rPr>
           <w:rFonts w:ascii="DejaVu Sans" w:hAnsi="DejaVu Sans" w:eastAsia="DejaVu Sans" w:cs="DejaVu Sans"/>
-          <w:lang w:val="ru-RU"/>
+          <w:b/>
           <w:sz w:val="28"/>
+          <w:lang w:val="ru-RU"/>
+        </w:rPr>
+        <w:t xml:space="preserve">1. Введение: вопросы посетителя</w:t>
+      </w:r>
+    </w:p>
+    <w:p>
+      <w:pPr>
+        <w:spacing w:after="120"/>
+      </w:pPr>
+      <w:r>
+        <w:rPr>
+          <w:rFonts w:ascii="DejaVu Sans" w:hAnsi="DejaVu Sans" w:eastAsia="DejaVu Sans" w:cs="DejaVu Sans"/>
+          <w:sz w:val="22"/>
+          <w:lang w:val="ru-RU"/>
+        </w:rPr>
+        <w:t xml:space="preserve">Условная ситуация: человек впервые приходит в незнакомый храм и не знает, можно ли сейчас войти. За первым вопросом возникают следующие: где остановиться, как присоединиться к молитве, когда выйти, не мешая другим? Это рамка исследования, а не описание личного опыта автора и не единый обязательный ритуал.</w:t>
+      </w:r>
+    </w:p>
+    <w:p>
+      <w:pPr>
+        <w:spacing w:after="120"/>
+      </w:pPr>
+      <w:r>
+        <w:rPr>
+          <w:rFonts w:ascii="DejaVu Sans" w:hAnsi="DejaVu Sans" w:eastAsia="DejaVu Sans" w:cs="DejaVu Sans"/>
+          <w:sz w:val="22"/>
+          <w:lang w:val="ru-RU"/>
+        </w:rPr>
+        <w:t xml:space="preserve">Возможность и способ участия посетителя в молитве также остаются вопросами к конкретной общине, а не заранее данным общим ответом.</w:t>
+      </w:r>
+    </w:p>
+    <w:p>
+      <w:pPr>
+        <w:spacing w:after="120"/>
+      </w:pPr>
+      <w:r>
+        <w:rPr>
+          <w:rFonts w:ascii="DejaVu Sans" w:hAnsi="DejaVu Sans" w:eastAsia="DejaVu Sans" w:cs="DejaVu Sans"/>
+          <w:sz w:val="22"/>
+          <w:lang w:val="ru-RU"/>
+        </w:rPr>
+        <w:t xml:space="preserve">Ответ полезен лишь тогда, когда понятно, для какой общины, службы и редакции текста он проверен. Поэтому ниже сначала обозначены пределы сравнения, а не предложена универсальная последовательность действий.</w:t>
+      </w:r>
+    </w:p>
+    <w:p>
+      <w:pPr>
+        <w:keepNext/>
+        <w:spacing w:after="120"/>
+        <w:outlineLvl w:val="0"/>
+      </w:pPr>
+      <w:r>
+        <w:rPr>
+          <w:rFonts w:ascii="DejaVu Sans" w:hAnsi="DejaVu Sans" w:eastAsia="DejaVu Sans" w:cs="DejaVu Sans"/>
           <w:b/>
-        </w:rPr>
-        <w:t xml:space="preserve">Содержание</w:t>
-      </w:r>
-    </w:p>
-    <w:p>
-      <w:pPr>
-        <w:spacing w:after="120"/>
-      </w:pPr>
-      <w:r>
-        <w:rPr>
-          <w:rFonts w:ascii="DejaVu Sans" w:hAnsi="DejaVu Sans" w:eastAsia="DejaVu Sans" w:cs="DejaVu Sans"/>
-          <w:lang w:val="ru-RU"/>
-          <w:sz w:val="22"/>
-        </w:rPr>
-        <w:t xml:space="preserve">1. Введение: вопросы посетителя</w:t>
-      </w:r>
-    </w:p>
-    <w:p>
-      <w:pPr>
-        <w:spacing w:after="120"/>
-      </w:pPr>
-      <w:r>
-        <w:rPr>
-          <w:rFonts w:ascii="DejaVu Sans" w:hAnsi="DejaVu Sans" w:eastAsia="DejaVu Sans" w:cs="DejaVu Sans"/>
-          <w:lang w:val="ru-RU"/>
-          <w:sz w:val="22"/>
+          <w:sz w:val="28"/>
+          <w:lang w:val="ru-RU"/>
         </w:rPr>
         <w:t xml:space="preserve">2. Границы сравнения и метод</w:t>
       </w:r>
@@ -176,8 +325,63 @@
       <w:r>
         <w:rPr>
           <w:rFonts w:ascii="DejaVu Sans" w:hAnsi="DejaVu Sans" w:eastAsia="DejaVu Sans" w:cs="DejaVu Sans"/>
-          <w:lang w:val="ru-RU"/>
-          <w:sz w:val="22"/>
+          <w:sz w:val="22"/>
+          <w:lang w:val="ru-RU"/>
+        </w:rPr>
+        <w:t xml:space="preserve">Сравниваются греко-православная практика Кипра, Армянская апостольская церковь по англоязычным церковным источникам и Болгарская православная церковь. Английский — язык исследования армянских источников, не утверждение о языке богослужения в Армении. Армянскую апостольскую традицию нельзя автоматически отождествлять с византийскими традициями Кипра и Болгарии.</w:t>
+      </w:r>
+    </w:p>
+    <w:p>
+      <w:pPr>
+        <w:spacing w:after="120"/>
+      </w:pPr>
+      <w:r>
+        <w:rPr>
+          <w:rFonts w:ascii="DejaVu Sans" w:hAnsi="DejaVu Sans" w:eastAsia="DejaVu Sans" w:cs="DejaVu Sans"/>
+          <w:sz w:val="22"/>
+          <w:lang w:val="ru-RU"/>
+        </w:rPr>
+        <w:t xml:space="preserve">Найденные армянские направления связаны с англоязычными церковными организациями диаспоры в США: Vemkar и Eastern Prelacy. Их юрисдикции, адресаты и применимость к общинам непосредственно в Армении требуют отдельной проверки. Они не представляют автоматически все местные практики Армянской апостольской церкви.</w:t>
+      </w:r>
+    </w:p>
+    <w:p>
+      <w:pPr>
+        <w:spacing w:after="120"/>
+      </w:pPr>
+      <w:r>
+        <w:rPr>
+          <w:rFonts w:ascii="DejaVu Sans" w:hAnsi="DejaVu Sans" w:eastAsia="DejaVu Sans" w:cs="DejaVu Sans"/>
+          <w:sz w:val="22"/>
+          <w:lang w:val="ru-RU"/>
+        </w:rPr>
+        <w:t xml:space="preserve">Исходный промпт прочитан полностью через GitHub MCP из коммита 391a15499a34310efd9dcd5ac85c038a344f7f0d. Библиография, 12 параметров оценки и результаты дедупликации вынесены в отдельный каталог books-ranked.md. Они не являются параллельным переводом.</w:t>
+      </w:r>
+    </w:p>
+    <w:p>
+      <w:pPr>
+        <w:spacing w:after="120"/>
+      </w:pPr>
+      <w:r>
+        <w:rPr>
+          <w:rFonts w:ascii="DejaVu Sans" w:hAnsi="DejaVu Sans" w:eastAsia="DejaVu Sans" w:cs="DejaVu Sans"/>
+          <w:sz w:val="22"/>
+          <w:lang w:val="ru-RU"/>
+        </w:rPr>
+        <w:t xml:space="preserve">Поисковая ссылка означает обнаружение кандидата. Для включения молитвы или обычая в пересечение требуется проверить источник каждой из трёх традиций. Совпадение названия молитвы не доказывает буквального совпадения редакций. Для публикации конкретного текста отдельно требуются установленные права.</w:t>
+      </w:r>
+    </w:p>
+    <w:p>
+      <w:pPr>
+        <w:keepNext/>
+        <w:spacing w:after="120"/>
+        <w:outlineLvl w:val="0"/>
+      </w:pPr>
+      <w:r>
+        <w:rPr>
+          <w:rFonts w:ascii="DejaVu Sans" w:hAnsi="DejaVu Sans" w:eastAsia="DejaVu Sans" w:cs="DejaVu Sans"/>
+          <w:b/>
+          <w:sz w:val="28"/>
+          <w:lang w:val="ru-RU"/>
         </w:rPr>
         <w:t xml:space="preserve">3. Подтверждённый молитвенный минимум</w:t>
       </w:r>
@@ -189,8 +393,24 @@
       <w:r>
         <w:rPr>
           <w:rFonts w:ascii="DejaVu Sans" w:hAnsi="DejaVu Sans" w:eastAsia="DejaVu Sans" w:cs="DejaVu Sans"/>
-          <w:lang w:val="ru-RU"/>
-          <w:sz w:val="22"/>
+          <w:sz w:val="22"/>
+          <w:lang w:val="ru-RU"/>
+        </w:rPr>
+        <w:t xml:space="preserve">В этой редакции нет элементов, прошедших проверку по всем трём традициям. Тексты молитв не воспроизводятся и не заменяются составительским пересказом. «Отче наш», краткие молитвенные возгласы и их языковые редакции остаются в очереди проверки, а не объявляются установленным общим минимумом.</w:t>
+      </w:r>
+    </w:p>
+    <w:p>
+      <w:pPr>
+        <w:keepNext/>
+        <w:spacing w:after="120"/>
+        <w:outlineLvl w:val="0"/>
+      </w:pPr>
+      <w:r>
+        <w:rPr>
+          <w:rFonts w:ascii="DejaVu Sans" w:hAnsi="DejaVu Sans" w:eastAsia="DejaVu Sans" w:cs="DejaVu Sans"/>
+          <w:b/>
+          <w:sz w:val="28"/>
+          <w:lang w:val="ru-RU"/>
         </w:rPr>
         <w:t xml:space="preserve">4. Подтверждённые общие обычаи</w:t>
       </w:r>
@@ -202,8 +422,29 @@
       <w:r>
         <w:rPr>
           <w:rFonts w:ascii="DejaVu Sans" w:hAnsi="DejaVu Sans" w:eastAsia="DejaVu Sans" w:cs="DejaVu Sans"/>
-          <w:lang w:val="ru-RU"/>
-          <w:sz w:val="22"/>
+          <w:sz w:val="22"/>
+          <w:lang w:val="ru-RU"/>
+        </w:rPr>
+        <w:t xml:space="preserve">Общее правило для трёх традиций пока не подтверждено непосредственно просмотренными первичными источниками. Вопросы об одежде, тишине, месте посетителя и времени входа/выхода требуют отдельного свидетельства каждой юрисдикции. Они не превращены в обязательные предписания.</w:t>
+      </w:r>
+    </w:p>
+    <w:p>
+      <w:r>
+        <w:br w:type="page"/>
+      </w:r>
+    </w:p>
+    <w:p>
+      <w:pPr>
+        <w:keepNext/>
+        <w:spacing w:after="120"/>
+        <w:outlineLvl w:val="0"/>
+      </w:pPr>
+      <w:r>
+        <w:rPr>
+          <w:rFonts w:ascii="DejaVu Sans" w:hAnsi="DejaVu Sans" w:eastAsia="DejaVu Sans" w:cs="DejaVu Sans"/>
+          <w:b/>
+          <w:sz w:val="28"/>
+          <w:lang w:val="ru-RU"/>
         </w:rPr>
         <w:t xml:space="preserve">5. Параллельные вопросы посетителя: редакционный макет</w:t>
       </w:r>
@@ -215,231 +456,28 @@
       <w:r>
         <w:rPr>
           <w:rFonts w:ascii="DejaVu Sans" w:hAnsi="DejaVu Sans" w:eastAsia="DejaVu Sans" w:cs="DejaVu Sans"/>
-          <w:lang w:val="ru-RU"/>
-          <w:sz w:val="22"/>
-        </w:rPr>
-        <w:t xml:space="preserve">6. Комментарии к различиям</w:t>
-      </w:r>
-    </w:p>
-    <w:p>
-      <w:pPr>
-        <w:spacing w:after="120"/>
-      </w:pPr>
-      <w:r>
-        <w:rPr>
-          <w:rFonts w:ascii="DejaVu Sans" w:hAnsi="DejaVu Sans" w:eastAsia="DejaVu Sans" w:cs="DejaVu Sans"/>
-          <w:lang w:val="ru-RU"/>
-          <w:sz w:val="22"/>
-        </w:rPr>
-        <w:t xml:space="preserve">7. Источники и очередь проверки</w:t>
-      </w:r>
-    </w:p>
-    <w:p>
-      <w:pPr>
-        <w:spacing w:after="120"/>
-      </w:pPr>
-      <w:r>
-        <w:rPr>
-          <w:rFonts w:ascii="DejaVu Sans" w:hAnsi="DejaVu Sans" w:eastAsia="DejaVu Sans" w:cs="DejaVu Sans"/>
-          <w:lang w:val="ru-RU"/>
-          <w:sz w:val="22"/>
-        </w:rPr>
-        <w:t xml:space="preserve">8. Ограничения проверки</w:t>
-      </w:r>
-    </w:p>
-    <w:p>
-      <w:pPr>
-        <w:spacing w:after="120"/>
-        <w:keepNext/>
-        <w:outlineLvl w:val="0"/>
-      </w:pPr>
-      <w:r>
-        <w:rPr>
-          <w:rFonts w:ascii="DejaVu Sans" w:hAnsi="DejaVu Sans" w:eastAsia="DejaVu Sans" w:cs="DejaVu Sans"/>
-          <w:lang w:val="ru-RU"/>
-          <w:sz w:val="28"/>
-          <w:b/>
-        </w:rPr>
-        <w:t xml:space="preserve">1. Введение: вопросы посетителя</w:t>
-      </w:r>
-    </w:p>
-    <w:p>
-      <w:pPr>
-        <w:spacing w:after="120"/>
-      </w:pPr>
-      <w:r>
-        <w:rPr>
-          <w:rFonts w:ascii="DejaVu Sans" w:hAnsi="DejaVu Sans" w:eastAsia="DejaVu Sans" w:cs="DejaVu Sans"/>
-          <w:lang w:val="ru-RU"/>
-          <w:sz w:val="22"/>
-        </w:rPr>
-        <w:t xml:space="preserve">Условная ситуация: человек впервые приходит в незнакомый храм и не знает, можно ли сейчас войти. За первым вопросом возникают следующие: где остановиться, как присоединиться к молитве, когда выйти, не мешая другим? Это рамка исследования, а не описание личного опыта автора и не единый обязательный ритуал.</w:t>
-      </w:r>
-    </w:p>
-    <w:p>
-      <w:pPr>
-        <w:spacing w:after="120"/>
-      </w:pPr>
-      <w:r>
-        <w:rPr>
-          <w:rFonts w:ascii="DejaVu Sans" w:hAnsi="DejaVu Sans" w:eastAsia="DejaVu Sans" w:cs="DejaVu Sans"/>
-          <w:lang w:val="ru-RU"/>
-          <w:sz w:val="22"/>
-        </w:rPr>
-        <w:t xml:space="preserve">Ответ полезен лишь тогда, когда понятно, для какой общины, службы и редакции текста он проверен. Поэтому ниже сначала обозначены пределы сравнения, а не предложена универсальная последовательность действий.</w:t>
-      </w:r>
-    </w:p>
-    <w:p>
-      <w:pPr>
-        <w:spacing w:after="120"/>
-        <w:keepNext/>
-        <w:outlineLvl w:val="0"/>
-      </w:pPr>
-      <w:r>
-        <w:rPr>
-          <w:rFonts w:ascii="DejaVu Sans" w:hAnsi="DejaVu Sans" w:eastAsia="DejaVu Sans" w:cs="DejaVu Sans"/>
-          <w:lang w:val="ru-RU"/>
-          <w:sz w:val="28"/>
-          <w:b/>
-        </w:rPr>
-        <w:t xml:space="preserve">2. Границы сравнения и метод</w:t>
-      </w:r>
-    </w:p>
-    <w:p>
-      <w:pPr>
-        <w:spacing w:after="120"/>
-      </w:pPr>
-      <w:r>
-        <w:rPr>
-          <w:rFonts w:ascii="DejaVu Sans" w:hAnsi="DejaVu Sans" w:eastAsia="DejaVu Sans" w:cs="DejaVu Sans"/>
-          <w:lang w:val="ru-RU"/>
-          <w:sz w:val="22"/>
-        </w:rPr>
-        <w:t xml:space="preserve">Сравниваются греко-православная практика Кипра, Армянская апостольская церковь по англоязычным церковным источникам и Болгарская православная церковь. Английский — язык исследования армянских источников, не утверждение о языке богослужения в Армении. Армянскую апостольскую традицию нельзя автоматически отождествлять с византийскими традициями Кипра и Болгарии.</w:t>
-      </w:r>
-    </w:p>
-    <w:p>
-      <w:pPr>
-        <w:spacing w:after="120"/>
-      </w:pPr>
-      <w:r>
-        <w:rPr>
-          <w:rFonts w:ascii="DejaVu Sans" w:hAnsi="DejaVu Sans" w:eastAsia="DejaVu Sans" w:cs="DejaVu Sans"/>
-          <w:lang w:val="ru-RU"/>
-          <w:sz w:val="22"/>
-        </w:rPr>
-        <w:t xml:space="preserve">Исходный промпт прочитан полностью через GitHub MCP из коммита 391a15499a34310efd9dcd5ac85c038a344f7f0d. Библиография, 12 параметров оценки и результаты дедупликации вынесены в отдельный каталог books-ranked.md. Они не являются параллельным переводом.</w:t>
-      </w:r>
-    </w:p>
-    <w:p>
-      <w:pPr>
-        <w:spacing w:after="120"/>
-      </w:pPr>
-      <w:r>
-        <w:rPr>
-          <w:rFonts w:ascii="DejaVu Sans" w:hAnsi="DejaVu Sans" w:eastAsia="DejaVu Sans" w:cs="DejaVu Sans"/>
-          <w:lang w:val="ru-RU"/>
-          <w:sz w:val="22"/>
-        </w:rPr>
-        <w:t xml:space="preserve">Поисковая ссылка означает обнаружение кандидата. Для включения молитвы или обычая в пересечение требуется проверить источник каждой из трёх традиций. Совпадение названия молитвы не доказывает буквального совпадения редакций. Для публикации конкретного текста отдельно требуются установленные права.</w:t>
-      </w:r>
-    </w:p>
-    <w:p>
-      <w:pPr>
-        <w:spacing w:after="120"/>
-        <w:keepNext/>
-        <w:outlineLvl w:val="0"/>
-      </w:pPr>
-      <w:r>
-        <w:rPr>
-          <w:rFonts w:ascii="DejaVu Sans" w:hAnsi="DejaVu Sans" w:eastAsia="DejaVu Sans" w:cs="DejaVu Sans"/>
-          <w:lang w:val="ru-RU"/>
-          <w:sz w:val="28"/>
-          <w:b/>
-        </w:rPr>
-        <w:t xml:space="preserve">3. Подтверждённый молитвенный минимум</w:t>
-      </w:r>
-    </w:p>
-    <w:p>
-      <w:pPr>
-        <w:spacing w:after="120"/>
-      </w:pPr>
-      <w:r>
-        <w:rPr>
-          <w:rFonts w:ascii="DejaVu Sans" w:hAnsi="DejaVu Sans" w:eastAsia="DejaVu Sans" w:cs="DejaVu Sans"/>
-          <w:lang w:val="ru-RU"/>
-          <w:sz w:val="22"/>
-        </w:rPr>
-        <w:t xml:space="preserve">В этой редакции нет элементов, прошедших проверку по всем трём традициям. Тексты молитв не воспроизводятся и не заменяются составительским пересказом. «Отче наш», краткие молитвенные возгласы и их языковые редакции остаются в очереди проверки, а не объявляются установленным общим минимумом.</w:t>
-      </w:r>
-    </w:p>
-    <w:p>
-      <w:pPr>
-        <w:spacing w:after="120"/>
-        <w:keepNext/>
-        <w:outlineLvl w:val="0"/>
-      </w:pPr>
-      <w:r>
-        <w:rPr>
-          <w:rFonts w:ascii="DejaVu Sans" w:hAnsi="DejaVu Sans" w:eastAsia="DejaVu Sans" w:cs="DejaVu Sans"/>
-          <w:lang w:val="ru-RU"/>
-          <w:sz w:val="28"/>
-          <w:b/>
-        </w:rPr>
-        <w:t xml:space="preserve">4. Подтверждённые общие обычаи</w:t>
-      </w:r>
-    </w:p>
-    <w:p>
-      <w:pPr>
-        <w:spacing w:after="120"/>
-      </w:pPr>
-      <w:r>
-        <w:rPr>
-          <w:rFonts w:ascii="DejaVu Sans" w:hAnsi="DejaVu Sans" w:eastAsia="DejaVu Sans" w:cs="DejaVu Sans"/>
-          <w:lang w:val="ru-RU"/>
-          <w:sz w:val="22"/>
-        </w:rPr>
-        <w:t xml:space="preserve">Общее правило для трёх традиций пока не подтверждено непосредственно просмотренными первичными источниками. Вопросы об одежде, тишине, месте посетителя и времени входа/выхода требуют отдельного свидетельства каждой юрисдикции. Они не превращены в обязательные предписания.</w:t>
-      </w:r>
-    </w:p>
-    <w:p>
-      <w:r>
-        <w:br w:type="page"/>
-      </w:r>
-    </w:p>
-    <w:p>
-      <w:pPr>
-        <w:spacing w:after="120"/>
-        <w:keepNext/>
-        <w:outlineLvl w:val="0"/>
-      </w:pPr>
-      <w:r>
-        <w:rPr>
-          <w:rFonts w:ascii="DejaVu Sans" w:hAnsi="DejaVu Sans" w:eastAsia="DejaVu Sans" w:cs="DejaVu Sans"/>
-          <w:lang w:val="ru-RU"/>
-          <w:sz w:val="28"/>
-          <w:b/>
-        </w:rPr>
-        <w:t xml:space="preserve">5. Параллельные вопросы посетителя: редакционный макет</w:t>
-      </w:r>
-    </w:p>
-    <w:p>
-      <w:pPr>
-        <w:spacing w:after="120"/>
-      </w:pPr>
-      <w:r>
-        <w:rPr>
-          <w:rFonts w:ascii="DejaVu Sans" w:hAnsi="DejaVu Sans" w:eastAsia="DejaVu Sans" w:cs="DejaVu Sans"/>
-          <w:lang w:val="ru-RU"/>
-          <w:sz w:val="22"/>
+          <w:sz w:val="22"/>
+          <w:lang w:val="ru-RU"/>
         </w:rPr>
         <w:t xml:space="preserve">Следующая таблица содержит только составительские переводы вопросов для дальнейшей проверки. Это не молитвы, не цитаты, не официальные церковные формулировки и не подтверждённые общие обычаи. Каждая строка передаёт один вопрос. Языковая проверка средствами ИИ не заменяет редактора — носителя языка.</w:t>
+      </w:r>
+    </w:p>
+    <w:p>
+      <w:pPr>
+        <w:spacing w:after="120"/>
+      </w:pPr>
+      <w:r>
+        <w:rPr>
+          <w:rFonts w:ascii="DejaVu Sans" w:hAnsi="DejaVu Sans" w:eastAsia="DejaVu Sans" w:cs="DejaVu Sans"/>
+          <w:sz w:val="22"/>
+          <w:lang w:val="ru-RU"/>
+        </w:rPr>
+        <w:t xml:space="preserve">Английский столбец передаёт тот же вопрос посетителя; это не перевод на армянский язык и не цитата из армянского церковного источника.</w:t>
       </w:r>
     </w:p>
     <w:tbl>
       <w:tblPr>
         <w:tblW w:w="14400" w:type="dxa"/>
-        <w:tblLayout w:type="fixed"/>
         <w:tblBorders>
           <w:top w:val="single" w:sz="4" w:color="808080"/>
           <w:left w:val="single" w:sz="4" w:color="808080"/>
@@ -448,6 +486,7 @@
           <w:insideH w:val="single" w:sz="4" w:color="808080"/>
           <w:insideV w:val="single" w:sz="4" w:color="808080"/>
         </w:tblBorders>
+        <w:tblLayout w:type="fixed"/>
       </w:tblPr>
       <w:tblGrid>
         <w:gridCol w:w="4800"/>
@@ -469,8 +508,8 @@
             <w:r>
               <w:rPr>
                 <w:rFonts w:ascii="DejaVu Sans" w:hAnsi="DejaVu Sans" w:eastAsia="DejaVu Sans" w:cs="DejaVu Sans"/>
+                <w:sz w:val="22"/>
                 <w:lang w:val="el-GR"/>
-                <w:sz w:val="22"/>
               </w:rPr>
               <w:t xml:space="preserve">Ελληνικά</w:t>
             </w:r>
@@ -487,8 +526,8 @@
             <w:r>
               <w:rPr>
                 <w:rFonts w:ascii="DejaVu Sans" w:hAnsi="DejaVu Sans" w:eastAsia="DejaVu Sans" w:cs="DejaVu Sans"/>
+                <w:sz w:val="22"/>
                 <w:lang w:val="en-US"/>
-                <w:sz w:val="22"/>
               </w:rPr>
               <w:t xml:space="preserve">English</w:t>
             </w:r>
@@ -505,8 +544,8 @@
             <w:r>
               <w:rPr>
                 <w:rFonts w:ascii="DejaVu Sans" w:hAnsi="DejaVu Sans" w:eastAsia="DejaVu Sans" w:cs="DejaVu Sans"/>
+                <w:sz w:val="22"/>
                 <w:lang w:val="bg-BG"/>
-                <w:sz w:val="22"/>
               </w:rPr>
               <w:t xml:space="preserve">Български</w:t>
             </w:r>
@@ -525,8 +564,8 @@
             <w:r>
               <w:rPr>
                 <w:rFonts w:ascii="DejaVu Sans" w:hAnsi="DejaVu Sans" w:eastAsia="DejaVu Sans" w:cs="DejaVu Sans"/>
+                <w:sz w:val="22"/>
                 <w:lang w:val="el-GR"/>
-                <w:sz w:val="22"/>
               </w:rPr>
               <w:t xml:space="preserve">Μπορώ να μπω τώρα χωρίς να ενοχλήσω την ακολουθία;</w:t>
             </w:r>
@@ -543,8 +582,8 @@
             <w:r>
               <w:rPr>
                 <w:rFonts w:ascii="DejaVu Sans" w:hAnsi="DejaVu Sans" w:eastAsia="DejaVu Sans" w:cs="DejaVu Sans"/>
+                <w:sz w:val="22"/>
                 <w:lang w:val="en-US"/>
-                <w:sz w:val="22"/>
               </w:rPr>
               <w:t xml:space="preserve">May I enter now without disturbing the service?</w:t>
             </w:r>
@@ -561,8 +600,8 @@
             <w:r>
               <w:rPr>
                 <w:rFonts w:ascii="DejaVu Sans" w:hAnsi="DejaVu Sans" w:eastAsia="DejaVu Sans" w:cs="DejaVu Sans"/>
+                <w:sz w:val="22"/>
                 <w:lang w:val="bg-BG"/>
-                <w:sz w:val="22"/>
               </w:rPr>
               <w:t xml:space="preserve">Мога ли да вляза сега, без да преча на богослужението?</w:t>
             </w:r>
@@ -581,8 +620,8 @@
             <w:r>
               <w:rPr>
                 <w:rFonts w:ascii="DejaVu Sans" w:hAnsi="DejaVu Sans" w:eastAsia="DejaVu Sans" w:cs="DejaVu Sans"/>
+                <w:sz w:val="22"/>
                 <w:lang w:val="el-GR"/>
-                <w:sz w:val="22"/>
               </w:rPr>
               <w:t xml:space="preserve">Πού μπορώ να σταθώ;</w:t>
             </w:r>
@@ -599,8 +638,8 @@
             <w:r>
               <w:rPr>
                 <w:rFonts w:ascii="DejaVu Sans" w:hAnsi="DejaVu Sans" w:eastAsia="DejaVu Sans" w:cs="DejaVu Sans"/>
+                <w:sz w:val="22"/>
                 <w:lang w:val="en-US"/>
-                <w:sz w:val="22"/>
               </w:rPr>
               <w:t xml:space="preserve">Where may I stand?</w:t>
             </w:r>
@@ -617,8 +656,8 @@
             <w:r>
               <w:rPr>
                 <w:rFonts w:ascii="DejaVu Sans" w:hAnsi="DejaVu Sans" w:eastAsia="DejaVu Sans" w:cs="DejaVu Sans"/>
+                <w:sz w:val="22"/>
                 <w:lang w:val="bg-BG"/>
-                <w:sz w:val="22"/>
               </w:rPr>
               <w:t xml:space="preserve">Къде мога да застана?</w:t>
             </w:r>
@@ -637,8 +676,8 @@
             <w:r>
               <w:rPr>
                 <w:rFonts w:ascii="DejaVu Sans" w:hAnsi="DejaVu Sans" w:eastAsia="DejaVu Sans" w:cs="DejaVu Sans"/>
+                <w:sz w:val="22"/>
                 <w:lang w:val="el-GR"/>
-                <w:sz w:val="22"/>
               </w:rPr>
               <w:t xml:space="preserve">Ποιο κείμενο προσευχής χρησιμοποιείται σε αυτή την κοινότητα;</w:t>
             </w:r>
@@ -655,8 +694,8 @@
             <w:r>
               <w:rPr>
                 <w:rFonts w:ascii="DejaVu Sans" w:hAnsi="DejaVu Sans" w:eastAsia="DejaVu Sans" w:cs="DejaVu Sans"/>
+                <w:sz w:val="22"/>
                 <w:lang w:val="en-US"/>
-                <w:sz w:val="22"/>
               </w:rPr>
               <w:t xml:space="preserve">Which prayer text is used in this community?</w:t>
             </w:r>
@@ -673,8 +712,8 @@
             <w:r>
               <w:rPr>
                 <w:rFonts w:ascii="DejaVu Sans" w:hAnsi="DejaVu Sans" w:eastAsia="DejaVu Sans" w:cs="DejaVu Sans"/>
+                <w:sz w:val="22"/>
                 <w:lang w:val="bg-BG"/>
-                <w:sz w:val="22"/>
               </w:rPr>
               <w:t xml:space="preserve">Кой молитвен текст се използва в тази общност?</w:t>
             </w:r>
@@ -693,8 +732,8 @@
             <w:r>
               <w:rPr>
                 <w:rFonts w:ascii="DejaVu Sans" w:hAnsi="DejaVu Sans" w:eastAsia="DejaVu Sans" w:cs="DejaVu Sans"/>
+                <w:sz w:val="22"/>
                 <w:lang w:val="el-GR"/>
-                <w:sz w:val="22"/>
               </w:rPr>
               <w:t xml:space="preserve">Πότε μπορώ να φύγω χωρίς να ενοχλήσω τους άλλους;</w:t>
             </w:r>
@@ -711,8 +750,8 @@
             <w:r>
               <w:rPr>
                 <w:rFonts w:ascii="DejaVu Sans" w:hAnsi="DejaVu Sans" w:eastAsia="DejaVu Sans" w:cs="DejaVu Sans"/>
+                <w:sz w:val="22"/>
                 <w:lang w:val="en-US"/>
-                <w:sz w:val="22"/>
               </w:rPr>
               <w:t xml:space="preserve">When may I leave without disturbing others?</w:t>
             </w:r>
@@ -729,8 +768,8 @@
             <w:r>
               <w:rPr>
                 <w:rFonts w:ascii="DejaVu Sans" w:hAnsi="DejaVu Sans" w:eastAsia="DejaVu Sans" w:cs="DejaVu Sans"/>
+                <w:sz w:val="22"/>
                 <w:lang w:val="bg-BG"/>
-                <w:sz w:val="22"/>
               </w:rPr>
               <w:t xml:space="preserve">Кога мога да си тръгна, без да преча на другите?</w:t>
             </w:r>
@@ -740,58 +779,58 @@
     </w:tbl>
     <w:p>
       <w:pPr>
-        <w:spacing w:after="120"/>
         <w:keepNext/>
+        <w:spacing w:after="120"/>
         <w:outlineLvl w:val="0"/>
       </w:pPr>
       <w:r>
         <w:rPr>
           <w:rFonts w:ascii="DejaVu Sans" w:hAnsi="DejaVu Sans" w:eastAsia="DejaVu Sans" w:cs="DejaVu Sans"/>
-          <w:lang w:val="ru-RU"/>
+          <w:b/>
           <w:sz w:val="28"/>
+          <w:lang w:val="ru-RU"/>
+        </w:rPr>
+        <w:t xml:space="preserve">6. Комментарии к различиям</w:t>
+      </w:r>
+    </w:p>
+    <w:p>
+      <w:pPr>
+        <w:spacing w:after="120"/>
+      </w:pPr>
+      <w:r>
+        <w:rPr>
+          <w:rFonts w:ascii="DejaVu Sans" w:hAnsi="DejaVu Sans" w:eastAsia="DejaVu Sans" w:cs="DejaVu Sans"/>
+          <w:sz w:val="22"/>
+          <w:lang w:val="ru-RU"/>
+        </w:rPr>
+        <w:t xml:space="preserve">Источник греческой православной традиции вне Кипра не устанавливает местную кипрскую практику. Английская редакция армянского молитвенника не подтверждает употребление её формулировок в двух других церквах. Печатный болгарский молитвенник и сетевые главы нельзя считать разными книгами без доказательства самостоятельности изданий.</w:t>
+      </w:r>
+    </w:p>
+    <w:p>
+      <w:pPr>
+        <w:spacing w:after="120"/>
+      </w:pPr>
+      <w:r>
+        <w:rPr>
+          <w:rFonts w:ascii="DejaVu Sans" w:hAnsi="DejaVu Sans" w:eastAsia="DejaVu Sans" w:cs="DejaVu Sans"/>
+          <w:sz w:val="22"/>
+          <w:lang w:val="ru-RU"/>
+        </w:rPr>
+        <w:t xml:space="preserve">В следующей редакции нужно отдельно сопоставить обращения, окончания молитв, роль священнослужителя и мирянина, а также контекст личной молитвы и общей службы. Пока такие различия не проверены, они не заполнены догадками.</w:t>
+      </w:r>
+    </w:p>
+    <w:p>
+      <w:pPr>
+        <w:keepNext/>
+        <w:spacing w:after="120"/>
+        <w:outlineLvl w:val="0"/>
+      </w:pPr>
+      <w:r>
+        <w:rPr>
+          <w:rFonts w:ascii="DejaVu Sans" w:hAnsi="DejaVu Sans" w:eastAsia="DejaVu Sans" w:cs="DejaVu Sans"/>
           <w:b/>
-        </w:rPr>
-        <w:t xml:space="preserve">6. Комментарии к различиям</w:t>
-      </w:r>
-    </w:p>
-    <w:p>
-      <w:pPr>
-        <w:spacing w:after="120"/>
-      </w:pPr>
-      <w:r>
-        <w:rPr>
-          <w:rFonts w:ascii="DejaVu Sans" w:hAnsi="DejaVu Sans" w:eastAsia="DejaVu Sans" w:cs="DejaVu Sans"/>
-          <w:lang w:val="ru-RU"/>
-          <w:sz w:val="22"/>
-        </w:rPr>
-        <w:t xml:space="preserve">Источник греческой православной традиции вне Кипра не устанавливает местную кипрскую практику. Английская редакция армянского молитвенника не подтверждает употребление её формулировок в двух других церквах. Печатный болгарский молитвенник и сетевые главы нельзя считать разными книгами без доказательства самостоятельности изданий.</w:t>
-      </w:r>
-    </w:p>
-    <w:p>
-      <w:pPr>
-        <w:spacing w:after="120"/>
-      </w:pPr>
-      <w:r>
-        <w:rPr>
-          <w:rFonts w:ascii="DejaVu Sans" w:hAnsi="DejaVu Sans" w:eastAsia="DejaVu Sans" w:cs="DejaVu Sans"/>
-          <w:lang w:val="ru-RU"/>
-          <w:sz w:val="22"/>
-        </w:rPr>
-        <w:t xml:space="preserve">В следующей редакции нужно отдельно сопоставить обращения, окончания молитв, роль священнослужителя и мирянина, а также контекст личной молитвы и общей службы. Пока такие различия не проверены, они не заполнены догадками.</w:t>
-      </w:r>
-    </w:p>
-    <w:p>
-      <w:pPr>
-        <w:spacing w:after="120"/>
-        <w:keepNext/>
-        <w:outlineLvl w:val="0"/>
-      </w:pPr>
-      <w:r>
-        <w:rPr>
-          <w:rFonts w:ascii="DejaVu Sans" w:hAnsi="DejaVu Sans" w:eastAsia="DejaVu Sans" w:cs="DejaVu Sans"/>
-          <w:lang w:val="ru-RU"/>
           <w:sz w:val="28"/>
-          <w:b/>
+          <w:lang w:val="ru-RU"/>
         </w:rPr>
         <w:t xml:space="preserve">7. Источники и очередь проверки</w:t>
       </w:r>
@@ -803,8 +842,8 @@
       <w:r>
         <w:rPr>
           <w:rFonts w:ascii="DejaVu Sans" w:hAnsi="DejaVu Sans" w:eastAsia="DejaVu Sans" w:cs="DejaVu Sans"/>
-          <w:lang w:val="ru-RU"/>
-          <w:sz w:val="22"/>
+          <w:sz w:val="22"/>
+          <w:lang w:val="ru-RU"/>
         </w:rPr>
         <w:t xml:space="preserve">Ниже — направления проверки, а не доказательная база готового пересечения. Их статус, библиография и права отмечаются в отдельном каталоге и манифесте.</w:t>
       </w:r>
@@ -816,8 +855,8 @@
       <w:r>
         <w:rPr>
           <w:rFonts w:ascii="DejaVu Sans" w:hAnsi="DejaVu Sans" w:eastAsia="DejaVu Sans" w:cs="DejaVu Sans"/>
-          <w:lang w:val="ru-RU"/>
-          <w:sz w:val="22"/>
+          <w:sz w:val="22"/>
+          <w:lang w:val="ru-RU"/>
         </w:rPr>
         <w:t xml:space="preserve">Церковь Кипра, «Προσευχητάριο: Πρωϊνή προσευχή»: </w:t>
       </w:r>
@@ -825,8 +864,8 @@
         <w:r>
           <w:rPr>
             <w:rFonts w:ascii="DejaVu Sans" w:hAnsi="DejaVu Sans" w:eastAsia="DejaVu Sans" w:cs="DejaVu Sans"/>
+            <w:sz w:val="22"/>
             <w:lang w:val="ru-RU"/>
-            <w:sz w:val="22"/>
           </w:rPr>
           <w:t xml:space="preserve">https://churchofcyprus.org.cy/8571</w:t>
         </w:r>
@@ -839,8 +878,8 @@
       <w:r>
         <w:rPr>
           <w:rFonts w:ascii="DejaVu Sans" w:hAnsi="DejaVu Sans" w:eastAsia="DejaVu Sans" w:cs="DejaVu Sans"/>
-          <w:lang w:val="ru-RU"/>
-          <w:sz w:val="22"/>
+          <w:sz w:val="22"/>
+          <w:lang w:val="ru-RU"/>
         </w:rPr>
         <w:t xml:space="preserve">Болгарская патриархия, каталог молитвенника: </w:t>
       </w:r>
@@ -848,8 +887,8 @@
         <w:r>
           <w:rPr>
             <w:rFonts w:ascii="DejaVu Sans" w:hAnsi="DejaVu Sans" w:eastAsia="DejaVu Sans" w:cs="DejaVu Sans"/>
+            <w:sz w:val="22"/>
             <w:lang w:val="ru-RU"/>
-            <w:sz w:val="22"/>
           </w:rPr>
           <w:t xml:space="preserve">https://bg-patriarshia.bg/bookshop-books/molitvenik</w:t>
         </w:r>
@@ -862,8 +901,8 @@
       <w:r>
         <w:rPr>
           <w:rFonts w:ascii="DejaVu Sans" w:hAnsi="DejaVu Sans" w:eastAsia="DejaVu Sans" w:cs="DejaVu Sans"/>
-          <w:lang w:val="ru-RU"/>
-          <w:sz w:val="22"/>
+          <w:sz w:val="22"/>
+          <w:lang w:val="ru-RU"/>
         </w:rPr>
         <w:t xml:space="preserve">Болгарская патриархия, сетевые молитвенные разделы: </w:t>
       </w:r>
@@ -871,8 +910,8 @@
         <w:r>
           <w:rPr>
             <w:rFonts w:ascii="DejaVu Sans" w:hAnsi="DejaVu Sans" w:eastAsia="DejaVu Sans" w:cs="DejaVu Sans"/>
+            <w:sz w:val="22"/>
             <w:lang w:val="ru-RU"/>
-            <w:sz w:val="22"/>
           </w:rPr>
           <w:t xml:space="preserve">https://bg-patriarshia.bg/liturgical-prayer</w:t>
         </w:r>
@@ -885,8 +924,8 @@
       <w:r>
         <w:rPr>
           <w:rFonts w:ascii="DejaVu Sans" w:hAnsi="DejaVu Sans" w:eastAsia="DejaVu Sans" w:cs="DejaVu Sans"/>
-          <w:lang w:val="ru-RU"/>
-          <w:sz w:val="22"/>
+          <w:sz w:val="22"/>
+          <w:lang w:val="ru-RU"/>
         </w:rPr>
         <w:t xml:space="preserve">Armenian Prelacy, объявление издания «In Faith I Confess»: </w:t>
       </w:r>
@@ -894,8 +933,8 @@
         <w:r>
           <w:rPr>
             <w:rFonts w:ascii="DejaVu Sans" w:hAnsi="DejaVu Sans" w:eastAsia="DejaVu Sans" w:cs="DejaVu Sans"/>
+            <w:sz w:val="22"/>
             <w:lang w:val="ru-RU"/>
-            <w:sz w:val="22"/>
           </w:rPr>
           <w:t xml:space="preserve">https://armenianprelacy.org/2022/06/16/new-edition-of-st-nerses-shnorhalis-in-faith-i-confess/</w:t>
         </w:r>
@@ -908,8 +947,8 @@
       <w:r>
         <w:rPr>
           <w:rFonts w:ascii="DejaVu Sans" w:hAnsi="DejaVu Sans" w:eastAsia="DejaVu Sans" w:cs="DejaVu Sans"/>
-          <w:lang w:val="ru-RU"/>
-          <w:sz w:val="22"/>
+          <w:sz w:val="22"/>
+          <w:lang w:val="ru-RU"/>
         </w:rPr>
         <w:t xml:space="preserve">Vemkar, направление проверки брошюры об этикете: </w:t>
       </w:r>
@@ -917,8 +956,8 @@
         <w:r>
           <w:rPr>
             <w:rFonts w:ascii="DejaVu Sans" w:hAnsi="DejaVu Sans" w:eastAsia="DejaVu Sans" w:cs="DejaVu Sans"/>
+            <w:sz w:val="22"/>
             <w:lang w:val="ru-RU"/>
-            <w:sz w:val="22"/>
           </w:rPr>
           <w:t xml:space="preserve">https://vemkar.us/wp-content/uploads/2025/01/VTS-Church-Etiquette-WEB.pdf</w:t>
         </w:r>
@@ -926,16 +965,16 @@
     </w:p>
     <w:p>
       <w:pPr>
-        <w:spacing w:after="120"/>
         <w:keepNext/>
+        <w:spacing w:after="120"/>
         <w:outlineLvl w:val="0"/>
       </w:pPr>
       <w:r>
         <w:rPr>
           <w:rFonts w:ascii="DejaVu Sans" w:hAnsi="DejaVu Sans" w:eastAsia="DejaVu Sans" w:cs="DejaVu Sans"/>
-          <w:lang w:val="ru-RU"/>
+          <w:b/>
           <w:sz w:val="28"/>
-          <w:b/>
+          <w:lang w:val="ru-RU"/>
         </w:rPr>
         <w:t xml:space="preserve">8. Ограничения проверки</w:t>
       </w:r>
@@ -947,8 +986,8 @@
       <w:r>
         <w:rPr>
           <w:rFonts w:ascii="DejaVu Sans" w:hAnsi="DejaVu Sans" w:eastAsia="DejaVu Sans" w:cs="DejaVu Sans"/>
-          <w:lang w:val="ru-RU"/>
-          <w:sz w:val="22"/>
+          <w:sz w:val="22"/>
+          <w:lang w:val="ru-RU"/>
         </w:rPr>
         <w:t xml:space="preserve">Дата исследования: 18 октября 2026 года. В терминале GitHub доступен, а проверенные церковные домены возвращают ошибку DNS. Встроенный поиск даёт ссылки и выдержки, но прямой просмотр первичных страниц ограничен. Браузерный инструмент недоступен из-за ошибки транспорта. Это не основание объявлять сайты недоступными для всех.</w:t>
       </w:r>
@@ -960,21 +999,21 @@
       <w:r>
         <w:rPr>
           <w:rFonts w:ascii="DejaVu Sans" w:hAnsi="DejaVu Sans" w:eastAsia="DejaVu Sans" w:cs="DejaVu Sans"/>
-          <w:lang w:val="ru-RU"/>
-          <w:sz w:val="22"/>
-        </w:rPr>
-        <w:t xml:space="preserve">Никакие полные сторонние книги или современные переводы молитв в этот макет не импортированы. Составительские вопросы в таблице не считаются преобразованной книгой. Внешнее рецензирование, благословение и экспертная носительская языковая проверка не заявляются. Независимые проверки ИИ и решения редакции фиксируются в editorial-review.md.</w:t>
-      </w:r>
-    </w:p>
-    <w:p>
-      <w:pPr>
-        <w:spacing w:after="120"/>
-      </w:pPr>
-      <w:r>
-        <w:rPr>
-          <w:rFonts w:ascii="DejaVu Sans" w:hAnsi="DejaVu Sans" w:eastAsia="DejaVu Sans" w:cs="DejaVu Sans"/>
-          <w:lang w:val="ru-RU"/>
-          <w:sz w:val="22"/>
+          <w:sz w:val="22"/>
+          <w:lang w:val="ru-RU"/>
+        </w:rPr>
+        <w:t xml:space="preserve">Никакие полные сторонние книги или современные переводы молитв в этот макет не импортированы. Составительские вопросы в таблице не считаются преобразованной книгой. Внешнее рецензирование, благословение и профессиональная языковая редактура носителями соответствующих языков не заявляются. Независимые проверки ИИ и решения редакции фиксируются в editorial-review.md.</w:t>
+      </w:r>
+    </w:p>
+    <w:p>
+      <w:pPr>
+        <w:spacing w:after="120"/>
+      </w:pPr>
+      <w:r>
+        <w:rPr>
+          <w:rFonts w:ascii="DejaVu Sans" w:hAnsi="DejaVu Sans" w:eastAsia="DejaVu Sans" w:cs="DejaVu Sans"/>
+          <w:sz w:val="22"/>
+          <w:lang w:val="ru-RU"/>
         </w:rPr>
         <w:t xml:space="preserve">DOCX собран стандартной библиотекой Python. Проверяются непустой ZIP, XML, word/document.xml, сохранность текста, три равные ячейки, повтор заголовка и поле номера страницы. Визуальный просмотр в Word или другом рендерере не выполнен; переносы страниц и отсутствие визуальных дефектов требуют проверки человеком.</w:t>
       </w:r>

</xml_diff>

<commit_message>
Add Cyprus prayerbook lead and finalize honest third-attempt results
Co-authored-by: Leonidy431 <12783917+Leonidy431@users.noreply.github.com>
</commit_message>
<xml_diff>
--- a/deliverables/third-attempt/common-prayers-three-columns.docx
+++ b/deliverables/third-attempt/common-prayers-three-columns.docx
@@ -881,9 +881,55 @@
           <w:sz w:val="22"/>
           <w:lang w:val="ru-RU"/>
         </w:rPr>
+        <w:t xml:space="preserve">Митрополия Тримифунта, кандидат «Προσευχητάριον»; PDF и выходные данные не просмотрены: </w:t>
+      </w:r>
+      <w:hyperlink r:id="url2">
+        <w:r>
+          <w:rPr>
+            <w:rFonts w:ascii="DejaVu Sans" w:hAnsi="DejaVu Sans" w:eastAsia="DejaVu Sans" w:cs="DejaVu Sans"/>
+            <w:sz w:val="22"/>
+            <w:lang w:val="ru-RU"/>
+          </w:rPr>
+          <w:t xml:space="preserve">https://imtrimythountos.org.cy/prosefxitarion/</w:t>
+        </w:r>
+      </w:hyperlink>
+    </w:p>
+    <w:p>
+      <w:pPr>
+        <w:spacing w:after="120"/>
+      </w:pPr>
+      <w:r>
+        <w:rPr>
+          <w:rFonts w:ascii="DejaVu Sans" w:hAnsi="DejaVu Sans" w:eastAsia="DejaVu Sans" w:cs="DejaVu Sans"/>
+          <w:sz w:val="22"/>
+          <w:lang w:val="ru-RU"/>
+        </w:rPr>
+        <w:t xml:space="preserve">Церковь Кипра, направление поиска статьи о входе в храм; советы не проверены: </w:t>
+      </w:r>
+      <w:hyperlink r:id="url3">
+        <w:r>
+          <w:rPr>
+            <w:rFonts w:ascii="DejaVu Sans" w:hAnsi="DejaVu Sans" w:eastAsia="DejaVu Sans" w:cs="DejaVu Sans"/>
+            <w:sz w:val="22"/>
+            <w:lang w:val="ru-RU"/>
+          </w:rPr>
+          <w:t xml:space="preserve">https://churchofcyprus.org.cy/8418</w:t>
+        </w:r>
+      </w:hyperlink>
+    </w:p>
+    <w:p>
+      <w:pPr>
+        <w:spacing w:after="120"/>
+      </w:pPr>
+      <w:r>
+        <w:rPr>
+          <w:rFonts w:ascii="DejaVu Sans" w:hAnsi="DejaVu Sans" w:eastAsia="DejaVu Sans" w:cs="DejaVu Sans"/>
+          <w:sz w:val="22"/>
+          <w:lang w:val="ru-RU"/>
+        </w:rPr>
         <w:t xml:space="preserve">Болгарская патриархия, каталог молитвенника: </w:t>
       </w:r>
-      <w:hyperlink r:id="url2">
+      <w:hyperlink r:id="url4">
         <w:r>
           <w:rPr>
             <w:rFonts w:ascii="DejaVu Sans" w:hAnsi="DejaVu Sans" w:eastAsia="DejaVu Sans" w:cs="DejaVu Sans"/>
@@ -906,7 +952,7 @@
         </w:rPr>
         <w:t xml:space="preserve">Болгарская патриархия, сетевые молитвенные разделы: </w:t>
       </w:r>
-      <w:hyperlink r:id="url3">
+      <w:hyperlink r:id="url5">
         <w:r>
           <w:rPr>
             <w:rFonts w:ascii="DejaVu Sans" w:hAnsi="DejaVu Sans" w:eastAsia="DejaVu Sans" w:cs="DejaVu Sans"/>
@@ -929,7 +975,7 @@
         </w:rPr>
         <w:t xml:space="preserve">Armenian Prelacy, объявление издания «In Faith I Confess»: </w:t>
       </w:r>
-      <w:hyperlink r:id="url4">
+      <w:hyperlink r:id="url6">
         <w:r>
           <w:rPr>
             <w:rFonts w:ascii="DejaVu Sans" w:hAnsi="DejaVu Sans" w:eastAsia="DejaVu Sans" w:cs="DejaVu Sans"/>
@@ -952,7 +998,7 @@
         </w:rPr>
         <w:t xml:space="preserve">Vemkar, направление проверки брошюры об этикете: </w:t>
       </w:r>
-      <w:hyperlink r:id="url5">
+      <w:hyperlink r:id="url7">
         <w:r>
           <w:rPr>
             <w:rFonts w:ascii="DejaVu Sans" w:hAnsi="DejaVu Sans" w:eastAsia="DejaVu Sans" w:cs="DejaVu Sans"/>

</xml_diff>

<commit_message>
Add bounded evidence pipeline and red-black five-book research layouts
Co-authored-by: Leonidy431 <12783917+Leonidy431@users.noreply.github.com>
</commit_message>
<xml_diff>
--- a/deliverables/third-attempt/common-prayers-three-columns.docx
+++ b/deliverables/third-attempt/common-prayers-three-columns.docx
@@ -4,12 +4,14 @@
   <w:body>
     <w:p>
       <w:pPr>
-        <w:spacing w:after="120"/>
-      </w:pPr>
-      <w:r>
-        <w:rPr>
-          <w:rFonts w:ascii="DejaVu Sans" w:hAnsi="DejaVu Sans" w:eastAsia="DejaVu Sans" w:cs="DejaVu Sans"/>
-          <w:sz w:val="22"/>
+        <w:spacing w:before="650" w:after="420" w:line="288" w:lineRule="auto"/>
+        <w:jc w:val="center"/>
+      </w:pPr>
+      <w:r>
+        <w:rPr>
+          <w:rFonts w:ascii="Liberation Serif" w:hAnsi="Liberation Serif" w:eastAsia="Liberation Serif" w:cs="Liberation Serif"/>
+          <w:color w:val="000000"/>
+          <w:sz w:val="23"/>
           <w:lang w:val="ru-RU"/>
         </w:rPr>
         <w:t xml:space="preserve">Гаврилов Леонид Геннадьевич</w:t>
@@ -17,12 +19,17 @@
     </w:p>
     <w:p>
       <w:pPr>
-        <w:spacing w:after="120"/>
-      </w:pPr>
-      <w:r>
-        <w:rPr>
-          <w:rFonts w:ascii="DejaVu Sans" w:hAnsi="DejaVu Sans" w:eastAsia="DejaVu Sans" w:cs="DejaVu Sans"/>
-          <w:sz w:val="22"/>
+        <w:pBdr>
+          <w:bottom w:val="single" w:sz="4" w:space="12" w:color="9B2424"/>
+        </w:pBdr>
+        <w:spacing w:before="240" w:after="420" w:line="288" w:lineRule="auto"/>
+        <w:jc w:val="center"/>
+      </w:pPr>
+      <w:r>
+        <w:rPr>
+          <w:rFonts w:ascii="Liberation Serif" w:hAnsi="Liberation Serif" w:eastAsia="Liberation Serif" w:cs="Liberation Serif"/>
+          <w:color w:val="000000"/>
+          <w:sz w:val="34"/>
           <w:lang w:val="ru-RU"/>
         </w:rPr>
         <w:t xml:space="preserve">Основные молитвы и поведение в храме</w:t>
@@ -30,12 +37,14 @@
     </w:p>
     <w:p>
       <w:pPr>
-        <w:spacing w:after="120"/>
-      </w:pPr>
-      <w:r>
-        <w:rPr>
-          <w:rFonts w:ascii="DejaVu Sans" w:hAnsi="DejaVu Sans" w:eastAsia="DejaVu Sans" w:cs="DejaVu Sans"/>
-          <w:sz w:val="22"/>
+        <w:spacing w:before="240" w:after="420" w:line="288" w:lineRule="auto"/>
+        <w:jc w:val="center"/>
+      </w:pPr>
+      <w:r>
+        <w:rPr>
+          <w:rFonts w:ascii="Liberation Serif" w:hAnsi="Liberation Serif" w:eastAsia="Liberation Serif" w:cs="Liberation Serif"/>
+          <w:color w:val="000000"/>
+          <w:sz w:val="23"/>
           <w:lang w:val="ru-RU"/>
         </w:rPr>
         <w:t xml:space="preserve">Кипр, Армения, Болгария: сравнительное исследование и трёхъязычная памятка</w:t>
@@ -43,12 +52,14 @@
     </w:p>
     <w:p>
       <w:pPr>
-        <w:spacing w:after="120"/>
-      </w:pPr>
-      <w:r>
-        <w:rPr>
-          <w:rFonts w:ascii="DejaVu Sans" w:hAnsi="DejaVu Sans" w:eastAsia="DejaVu Sans" w:cs="DejaVu Sans"/>
-          <w:sz w:val="22"/>
+        <w:spacing w:before="240" w:after="420" w:line="288" w:lineRule="auto"/>
+        <w:jc w:val="center"/>
+      </w:pPr>
+      <w:r>
+        <w:rPr>
+          <w:rFonts w:ascii="Liberation Serif" w:hAnsi="Liberation Serif" w:eastAsia="Liberation Serif" w:cs="Liberation Serif"/>
+          <w:color w:val="000000"/>
+          <w:sz w:val="23"/>
           <w:lang w:val="ru-RU"/>
         </w:rPr>
         <w:t xml:space="preserve">Монография</w:t>
@@ -56,12 +67,14 @@
     </w:p>
     <w:p>
       <w:pPr>
-        <w:spacing w:after="120"/>
-      </w:pPr>
-      <w:r>
-        <w:rPr>
-          <w:rFonts w:ascii="DejaVu Sans" w:hAnsi="DejaVu Sans" w:eastAsia="DejaVu Sans" w:cs="DejaVu Sans"/>
-          <w:sz w:val="22"/>
+        <w:spacing w:before="240" w:after="420" w:line="288" w:lineRule="auto"/>
+        <w:jc w:val="center"/>
+      </w:pPr>
+      <w:r>
+        <w:rPr>
+          <w:rFonts w:ascii="Liberation Serif" w:hAnsi="Liberation Serif" w:eastAsia="Liberation Serif" w:cs="Liberation Serif"/>
+          <w:color w:val="000000"/>
+          <w:sz w:val="23"/>
           <w:lang w:val="ru-RU"/>
         </w:rPr>
         <w:t xml:space="preserve">2026</w:t>
@@ -69,12 +82,17 @@
     </w:p>
     <w:p>
       <w:pPr>
-        <w:spacing w:after="120"/>
-      </w:pPr>
-      <w:r>
-        <w:rPr>
-          <w:rFonts w:ascii="DejaVu Sans" w:hAnsi="DejaVu Sans" w:eastAsia="DejaVu Sans" w:cs="DejaVu Sans"/>
-          <w:sz w:val="22"/>
+        <w:pBdr>
+          <w:bottom w:val="single" w:sz="4" w:space="12" w:color="9B2424"/>
+        </w:pBdr>
+        <w:spacing w:before="240" w:after="420" w:line="288" w:lineRule="auto"/>
+        <w:jc w:val="center"/>
+      </w:pPr>
+      <w:r>
+        <w:rPr>
+          <w:rFonts w:ascii="Liberation Serif" w:hAnsi="Liberation Serif" w:eastAsia="Liberation Serif" w:cs="Liberation Serif"/>
+          <w:color w:val="000000"/>
+          <w:sz w:val="23"/>
           <w:lang w:val="ru-RU"/>
         </w:rPr>
         <w:t xml:space="preserve">Рабочая исследовательская редакция</w:t>
@@ -82,12 +100,14 @@
     </w:p>
     <w:p>
       <w:pPr>
-        <w:spacing w:after="120"/>
-      </w:pPr>
-      <w:r>
-        <w:rPr>
-          <w:rFonts w:ascii="DejaVu Sans" w:hAnsi="DejaVu Sans" w:eastAsia="DejaVu Sans" w:cs="DejaVu Sans"/>
-          <w:sz w:val="22"/>
+        <w:spacing w:before="240" w:after="420" w:line="288" w:lineRule="auto"/>
+        <w:jc w:val="center"/>
+      </w:pPr>
+      <w:r>
+        <w:rPr>
+          <w:rFonts w:ascii="Liberation Serif" w:hAnsi="Liberation Serif" w:eastAsia="Liberation Serif" w:cs="Liberation Serif"/>
+          <w:color w:val="000000"/>
+          <w:sz w:val="23"/>
           <w:lang w:val="ru-RU"/>
         </w:rPr>
         <w:t xml:space="preserve">Редакционный макет незавершённой монографии. Не готовая книга, не проверенная молитвенная памятка и не церковно одобренное издание.</w:t>
@@ -101,13 +121,14 @@
     <w:p>
       <w:pPr>
         <w:keepNext/>
-        <w:spacing w:after="120"/>
+        <w:spacing w:before="0" w:after="140" w:line="288" w:lineRule="auto"/>
         <w:outlineLvl w:val="0"/>
       </w:pPr>
       <w:r>
         <w:rPr>
-          <w:rFonts w:ascii="DejaVu Sans" w:hAnsi="DejaVu Sans" w:eastAsia="DejaVu Sans" w:cs="DejaVu Sans"/>
+          <w:rFonts w:ascii="Liberation Serif" w:hAnsi="Liberation Serif" w:eastAsia="Liberation Serif" w:cs="Liberation Serif"/>
           <w:b/>
+          <w:color w:val="9B2424"/>
           <w:sz w:val="28"/>
           <w:lang w:val="ru-RU"/>
         </w:rPr>
@@ -116,12 +137,13 @@
     </w:p>
     <w:p>
       <w:pPr>
-        <w:spacing w:after="120"/>
-      </w:pPr>
-      <w:r>
-        <w:rPr>
-          <w:rFonts w:ascii="DejaVu Sans" w:hAnsi="DejaVu Sans" w:eastAsia="DejaVu Sans" w:cs="DejaVu Sans"/>
-          <w:sz w:val="22"/>
+        <w:spacing w:before="0" w:after="140" w:line="288" w:lineRule="auto"/>
+      </w:pPr>
+      <w:r>
+        <w:rPr>
+          <w:rFonts w:ascii="Liberation Serif" w:hAnsi="Liberation Serif" w:eastAsia="Liberation Serif" w:cs="Liberation Serif"/>
+          <w:color w:val="000000"/>
+          <w:sz w:val="23"/>
           <w:lang w:val="ru-RU"/>
         </w:rPr>
         <w:t xml:space="preserve">Работа поставлена как сравнение основных молитв и поведения посетителя храма в трёх традициях. Эта редакция сохраняет исследовательский вопрос, границы доказательств и параллельные составительские вопросы на трёх языках. Подтверждённое пересечение пока не установлено; отсутствие проверки не означает отсутствия общей практики.</w:t>
@@ -130,13 +152,14 @@
     <w:p>
       <w:pPr>
         <w:keepNext/>
-        <w:spacing w:after="120"/>
+        <w:spacing w:before="0" w:after="140" w:line="288" w:lineRule="auto"/>
         <w:outlineLvl w:val="0"/>
       </w:pPr>
       <w:r>
         <w:rPr>
-          <w:rFonts w:ascii="DejaVu Sans" w:hAnsi="DejaVu Sans" w:eastAsia="DejaVu Sans" w:cs="DejaVu Sans"/>
+          <w:rFonts w:ascii="Liberation Serif" w:hAnsi="Liberation Serif" w:eastAsia="Liberation Serif" w:cs="Liberation Serif"/>
           <w:b/>
+          <w:color w:val="9B2424"/>
           <w:sz w:val="28"/>
           <w:lang w:val="ru-RU"/>
         </w:rPr>
@@ -145,12 +168,13 @@
     </w:p>
     <w:p>
       <w:pPr>
-        <w:spacing w:after="120"/>
-      </w:pPr>
-      <w:r>
-        <w:rPr>
-          <w:rFonts w:ascii="DejaVu Sans" w:hAnsi="DejaVu Sans" w:eastAsia="DejaVu Sans" w:cs="DejaVu Sans"/>
-          <w:sz w:val="22"/>
+        <w:spacing w:before="0" w:after="140" w:line="288" w:lineRule="auto"/>
+      </w:pPr>
+      <w:r>
+        <w:rPr>
+          <w:rFonts w:ascii="Liberation Serif" w:hAnsi="Liberation Serif" w:eastAsia="Liberation Serif" w:cs="Liberation Serif"/>
+          <w:color w:val="000000"/>
+          <w:sz w:val="23"/>
           <w:lang w:val="ru-RU"/>
         </w:rPr>
         <w:t xml:space="preserve">1. Введение: вопросы посетителя</w:t>
@@ -158,12 +182,13 @@
     </w:p>
     <w:p>
       <w:pPr>
-        <w:spacing w:after="120"/>
-      </w:pPr>
-      <w:r>
-        <w:rPr>
-          <w:rFonts w:ascii="DejaVu Sans" w:hAnsi="DejaVu Sans" w:eastAsia="DejaVu Sans" w:cs="DejaVu Sans"/>
-          <w:sz w:val="22"/>
+        <w:spacing w:before="0" w:after="140" w:line="288" w:lineRule="auto"/>
+      </w:pPr>
+      <w:r>
+        <w:rPr>
+          <w:rFonts w:ascii="Liberation Serif" w:hAnsi="Liberation Serif" w:eastAsia="Liberation Serif" w:cs="Liberation Serif"/>
+          <w:color w:val="000000"/>
+          <w:sz w:val="23"/>
           <w:lang w:val="ru-RU"/>
         </w:rPr>
         <w:t xml:space="preserve">2. Границы сравнения и метод</w:t>
@@ -171,12 +196,13 @@
     </w:p>
     <w:p>
       <w:pPr>
-        <w:spacing w:after="120"/>
-      </w:pPr>
-      <w:r>
-        <w:rPr>
-          <w:rFonts w:ascii="DejaVu Sans" w:hAnsi="DejaVu Sans" w:eastAsia="DejaVu Sans" w:cs="DejaVu Sans"/>
-          <w:sz w:val="22"/>
+        <w:spacing w:before="0" w:after="140" w:line="288" w:lineRule="auto"/>
+      </w:pPr>
+      <w:r>
+        <w:rPr>
+          <w:rFonts w:ascii="Liberation Serif" w:hAnsi="Liberation Serif" w:eastAsia="Liberation Serif" w:cs="Liberation Serif"/>
+          <w:color w:val="000000"/>
+          <w:sz w:val="23"/>
           <w:lang w:val="ru-RU"/>
         </w:rPr>
         <w:t xml:space="preserve">3. Подтверждённый молитвенный минимум</w:t>
@@ -184,12 +210,13 @@
     </w:p>
     <w:p>
       <w:pPr>
-        <w:spacing w:after="120"/>
-      </w:pPr>
-      <w:r>
-        <w:rPr>
-          <w:rFonts w:ascii="DejaVu Sans" w:hAnsi="DejaVu Sans" w:eastAsia="DejaVu Sans" w:cs="DejaVu Sans"/>
-          <w:sz w:val="22"/>
+        <w:spacing w:before="0" w:after="140" w:line="288" w:lineRule="auto"/>
+      </w:pPr>
+      <w:r>
+        <w:rPr>
+          <w:rFonts w:ascii="Liberation Serif" w:hAnsi="Liberation Serif" w:eastAsia="Liberation Serif" w:cs="Liberation Serif"/>
+          <w:color w:val="000000"/>
+          <w:sz w:val="23"/>
           <w:lang w:val="ru-RU"/>
         </w:rPr>
         <w:t xml:space="preserve">4. Подтверждённые общие обычаи</w:t>
@@ -197,12 +224,13 @@
     </w:p>
     <w:p>
       <w:pPr>
-        <w:spacing w:after="120"/>
-      </w:pPr>
-      <w:r>
-        <w:rPr>
-          <w:rFonts w:ascii="DejaVu Sans" w:hAnsi="DejaVu Sans" w:eastAsia="DejaVu Sans" w:cs="DejaVu Sans"/>
-          <w:sz w:val="22"/>
+        <w:spacing w:before="0" w:after="140" w:line="288" w:lineRule="auto"/>
+      </w:pPr>
+      <w:r>
+        <w:rPr>
+          <w:rFonts w:ascii="Liberation Serif" w:hAnsi="Liberation Serif" w:eastAsia="Liberation Serif" w:cs="Liberation Serif"/>
+          <w:color w:val="000000"/>
+          <w:sz w:val="23"/>
           <w:lang w:val="ru-RU"/>
         </w:rPr>
         <w:t xml:space="preserve">5. Параллельные вопросы посетителя: редакционный макет</w:t>
@@ -210,12 +238,13 @@
     </w:p>
     <w:p>
       <w:pPr>
-        <w:spacing w:after="120"/>
-      </w:pPr>
-      <w:r>
-        <w:rPr>
-          <w:rFonts w:ascii="DejaVu Sans" w:hAnsi="DejaVu Sans" w:eastAsia="DejaVu Sans" w:cs="DejaVu Sans"/>
-          <w:sz w:val="22"/>
+        <w:spacing w:before="0" w:after="140" w:line="288" w:lineRule="auto"/>
+      </w:pPr>
+      <w:r>
+        <w:rPr>
+          <w:rFonts w:ascii="Liberation Serif" w:hAnsi="Liberation Serif" w:eastAsia="Liberation Serif" w:cs="Liberation Serif"/>
+          <w:color w:val="000000"/>
+          <w:sz w:val="23"/>
           <w:lang w:val="ru-RU"/>
         </w:rPr>
         <w:t xml:space="preserve">6. Комментарии к различиям</w:t>
@@ -223,12 +252,13 @@
     </w:p>
     <w:p>
       <w:pPr>
-        <w:spacing w:after="120"/>
-      </w:pPr>
-      <w:r>
-        <w:rPr>
-          <w:rFonts w:ascii="DejaVu Sans" w:hAnsi="DejaVu Sans" w:eastAsia="DejaVu Sans" w:cs="DejaVu Sans"/>
-          <w:sz w:val="22"/>
+        <w:spacing w:before="0" w:after="140" w:line="288" w:lineRule="auto"/>
+      </w:pPr>
+      <w:r>
+        <w:rPr>
+          <w:rFonts w:ascii="Liberation Serif" w:hAnsi="Liberation Serif" w:eastAsia="Liberation Serif" w:cs="Liberation Serif"/>
+          <w:color w:val="000000"/>
+          <w:sz w:val="23"/>
           <w:lang w:val="ru-RU"/>
         </w:rPr>
         <w:t xml:space="preserve">7. Источники и очередь проверки</w:t>
@@ -236,12 +266,13 @@
     </w:p>
     <w:p>
       <w:pPr>
-        <w:spacing w:after="120"/>
-      </w:pPr>
-      <w:r>
-        <w:rPr>
-          <w:rFonts w:ascii="DejaVu Sans" w:hAnsi="DejaVu Sans" w:eastAsia="DejaVu Sans" w:cs="DejaVu Sans"/>
-          <w:sz w:val="22"/>
+        <w:spacing w:before="0" w:after="140" w:line="288" w:lineRule="auto"/>
+      </w:pPr>
+      <w:r>
+        <w:rPr>
+          <w:rFonts w:ascii="Liberation Serif" w:hAnsi="Liberation Serif" w:eastAsia="Liberation Serif" w:cs="Liberation Serif"/>
+          <w:color w:val="000000"/>
+          <w:sz w:val="23"/>
           <w:lang w:val="ru-RU"/>
         </w:rPr>
         <w:t xml:space="preserve">8. Ограничения проверки</w:t>
@@ -250,13 +281,14 @@
     <w:p>
       <w:pPr>
         <w:keepNext/>
-        <w:spacing w:after="120"/>
+        <w:spacing w:before="0" w:after="140" w:line="288" w:lineRule="auto"/>
         <w:outlineLvl w:val="0"/>
       </w:pPr>
       <w:r>
         <w:rPr>
-          <w:rFonts w:ascii="DejaVu Sans" w:hAnsi="DejaVu Sans" w:eastAsia="DejaVu Sans" w:cs="DejaVu Sans"/>
+          <w:rFonts w:ascii="Liberation Serif" w:hAnsi="Liberation Serif" w:eastAsia="Liberation Serif" w:cs="Liberation Serif"/>
           <w:b/>
+          <w:color w:val="9B2424"/>
           <w:sz w:val="28"/>
           <w:lang w:val="ru-RU"/>
         </w:rPr>
@@ -265,12 +297,13 @@
     </w:p>
     <w:p>
       <w:pPr>
-        <w:spacing w:after="120"/>
-      </w:pPr>
-      <w:r>
-        <w:rPr>
-          <w:rFonts w:ascii="DejaVu Sans" w:hAnsi="DejaVu Sans" w:eastAsia="DejaVu Sans" w:cs="DejaVu Sans"/>
-          <w:sz w:val="22"/>
+        <w:spacing w:before="0" w:after="140" w:line="288" w:lineRule="auto"/>
+      </w:pPr>
+      <w:r>
+        <w:rPr>
+          <w:rFonts w:ascii="Liberation Serif" w:hAnsi="Liberation Serif" w:eastAsia="Liberation Serif" w:cs="Liberation Serif"/>
+          <w:color w:val="000000"/>
+          <w:sz w:val="23"/>
           <w:lang w:val="ru-RU"/>
         </w:rPr>
         <w:t xml:space="preserve">Условная ситуация: человек впервые приходит в незнакомый храм и не знает, можно ли сейчас войти. За первым вопросом возникают следующие: где остановиться, как присоединиться к молитве, когда выйти, не мешая другим? Это рамка исследования, а не описание личного опыта автора и не единый обязательный ритуал.</w:t>
@@ -278,12 +311,13 @@
     </w:p>
     <w:p>
       <w:pPr>
-        <w:spacing w:after="120"/>
-      </w:pPr>
-      <w:r>
-        <w:rPr>
-          <w:rFonts w:ascii="DejaVu Sans" w:hAnsi="DejaVu Sans" w:eastAsia="DejaVu Sans" w:cs="DejaVu Sans"/>
-          <w:sz w:val="22"/>
+        <w:spacing w:before="0" w:after="140" w:line="288" w:lineRule="auto"/>
+      </w:pPr>
+      <w:r>
+        <w:rPr>
+          <w:rFonts w:ascii="Liberation Serif" w:hAnsi="Liberation Serif" w:eastAsia="Liberation Serif" w:cs="Liberation Serif"/>
+          <w:color w:val="000000"/>
+          <w:sz w:val="23"/>
           <w:lang w:val="ru-RU"/>
         </w:rPr>
         <w:t xml:space="preserve">Возможность и способ участия посетителя в молитве также остаются вопросами к конкретной общине, а не заранее данным общим ответом.</w:t>
@@ -291,12 +325,13 @@
     </w:p>
     <w:p>
       <w:pPr>
-        <w:spacing w:after="120"/>
-      </w:pPr>
-      <w:r>
-        <w:rPr>
-          <w:rFonts w:ascii="DejaVu Sans" w:hAnsi="DejaVu Sans" w:eastAsia="DejaVu Sans" w:cs="DejaVu Sans"/>
-          <w:sz w:val="22"/>
+        <w:spacing w:before="0" w:after="140" w:line="288" w:lineRule="auto"/>
+      </w:pPr>
+      <w:r>
+        <w:rPr>
+          <w:rFonts w:ascii="Liberation Serif" w:hAnsi="Liberation Serif" w:eastAsia="Liberation Serif" w:cs="Liberation Serif"/>
+          <w:color w:val="000000"/>
+          <w:sz w:val="23"/>
           <w:lang w:val="ru-RU"/>
         </w:rPr>
         <w:t xml:space="preserve">Ответ полезен лишь тогда, когда понятно, для какой общины, службы и редакции текста он проверен. Поэтому ниже сначала обозначены пределы сравнения, а не предложена универсальная последовательность действий.</w:t>
@@ -305,13 +340,14 @@
     <w:p>
       <w:pPr>
         <w:keepNext/>
-        <w:spacing w:after="120"/>
+        <w:spacing w:before="0" w:after="140" w:line="288" w:lineRule="auto"/>
         <w:outlineLvl w:val="0"/>
       </w:pPr>
       <w:r>
         <w:rPr>
-          <w:rFonts w:ascii="DejaVu Sans" w:hAnsi="DejaVu Sans" w:eastAsia="DejaVu Sans" w:cs="DejaVu Sans"/>
+          <w:rFonts w:ascii="Liberation Serif" w:hAnsi="Liberation Serif" w:eastAsia="Liberation Serif" w:cs="Liberation Serif"/>
           <w:b/>
+          <w:color w:val="9B2424"/>
           <w:sz w:val="28"/>
           <w:lang w:val="ru-RU"/>
         </w:rPr>
@@ -320,12 +356,13 @@
     </w:p>
     <w:p>
       <w:pPr>
-        <w:spacing w:after="120"/>
-      </w:pPr>
-      <w:r>
-        <w:rPr>
-          <w:rFonts w:ascii="DejaVu Sans" w:hAnsi="DejaVu Sans" w:eastAsia="DejaVu Sans" w:cs="DejaVu Sans"/>
-          <w:sz w:val="22"/>
+        <w:spacing w:before="0" w:after="140" w:line="288" w:lineRule="auto"/>
+      </w:pPr>
+      <w:r>
+        <w:rPr>
+          <w:rFonts w:ascii="Liberation Serif" w:hAnsi="Liberation Serif" w:eastAsia="Liberation Serif" w:cs="Liberation Serif"/>
+          <w:color w:val="000000"/>
+          <w:sz w:val="23"/>
           <w:lang w:val="ru-RU"/>
         </w:rPr>
         <w:t xml:space="preserve">Сравниваются греко-православная практика Кипра, Армянская апостольская церковь по англоязычным церковным источникам и Болгарская православная церковь. Английский — язык исследования армянских источников, не утверждение о языке богослужения в Армении. Армянскую апостольскую традицию нельзя автоматически отождествлять с византийскими традициями Кипра и Болгарии.</w:t>
@@ -333,12 +370,13 @@
     </w:p>
     <w:p>
       <w:pPr>
-        <w:spacing w:after="120"/>
-      </w:pPr>
-      <w:r>
-        <w:rPr>
-          <w:rFonts w:ascii="DejaVu Sans" w:hAnsi="DejaVu Sans" w:eastAsia="DejaVu Sans" w:cs="DejaVu Sans"/>
-          <w:sz w:val="22"/>
+        <w:spacing w:before="0" w:after="140" w:line="288" w:lineRule="auto"/>
+      </w:pPr>
+      <w:r>
+        <w:rPr>
+          <w:rFonts w:ascii="Liberation Serif" w:hAnsi="Liberation Serif" w:eastAsia="Liberation Serif" w:cs="Liberation Serif"/>
+          <w:color w:val="000000"/>
+          <w:sz w:val="23"/>
           <w:lang w:val="ru-RU"/>
         </w:rPr>
         <w:t xml:space="preserve">Найденные армянские направления связаны с англоязычными церковными организациями диаспоры в США: Vemkar и Eastern Prelacy. Их юрисдикции, адресаты и применимость к общинам непосредственно в Армении требуют отдельной проверки. Они не представляют автоматически все местные практики Армянской апостольской церкви.</w:t>
@@ -346,12 +384,13 @@
     </w:p>
     <w:p>
       <w:pPr>
-        <w:spacing w:after="120"/>
-      </w:pPr>
-      <w:r>
-        <w:rPr>
-          <w:rFonts w:ascii="DejaVu Sans" w:hAnsi="DejaVu Sans" w:eastAsia="DejaVu Sans" w:cs="DejaVu Sans"/>
-          <w:sz w:val="22"/>
+        <w:spacing w:before="0" w:after="140" w:line="288" w:lineRule="auto"/>
+      </w:pPr>
+      <w:r>
+        <w:rPr>
+          <w:rFonts w:ascii="Liberation Serif" w:hAnsi="Liberation Serif" w:eastAsia="Liberation Serif" w:cs="Liberation Serif"/>
+          <w:color w:val="000000"/>
+          <w:sz w:val="23"/>
           <w:lang w:val="ru-RU"/>
         </w:rPr>
         <w:t xml:space="preserve">Исходный промпт прочитан полностью через GitHub MCP из коммита 391a15499a34310efd9dcd5ac85c038a344f7f0d. Библиография, 12 параметров оценки и результаты дедупликации вынесены в отдельный каталог books-ranked.md. Они не являются параллельным переводом.</w:t>
@@ -359,12 +398,13 @@
     </w:p>
     <w:p>
       <w:pPr>
-        <w:spacing w:after="120"/>
-      </w:pPr>
-      <w:r>
-        <w:rPr>
-          <w:rFonts w:ascii="DejaVu Sans" w:hAnsi="DejaVu Sans" w:eastAsia="DejaVu Sans" w:cs="DejaVu Sans"/>
-          <w:sz w:val="22"/>
+        <w:spacing w:before="0" w:after="140" w:line="288" w:lineRule="auto"/>
+      </w:pPr>
+      <w:r>
+        <w:rPr>
+          <w:rFonts w:ascii="Liberation Serif" w:hAnsi="Liberation Serif" w:eastAsia="Liberation Serif" w:cs="Liberation Serif"/>
+          <w:color w:val="000000"/>
+          <w:sz w:val="23"/>
           <w:lang w:val="ru-RU"/>
         </w:rPr>
         <w:t xml:space="preserve">Поисковая ссылка означает обнаружение кандидата. Для включения молитвы или обычая в пересечение требуется проверить источник каждой из трёх традиций. Совпадение названия молитвы не доказывает буквального совпадения редакций. Для публикации конкретного текста отдельно требуются установленные права.</w:t>
@@ -373,13 +413,14 @@
     <w:p>
       <w:pPr>
         <w:keepNext/>
-        <w:spacing w:after="120"/>
+        <w:spacing w:before="0" w:after="140" w:line="288" w:lineRule="auto"/>
         <w:outlineLvl w:val="0"/>
       </w:pPr>
       <w:r>
         <w:rPr>
-          <w:rFonts w:ascii="DejaVu Sans" w:hAnsi="DejaVu Sans" w:eastAsia="DejaVu Sans" w:cs="DejaVu Sans"/>
+          <w:rFonts w:ascii="Liberation Serif" w:hAnsi="Liberation Serif" w:eastAsia="Liberation Serif" w:cs="Liberation Serif"/>
           <w:b/>
+          <w:color w:val="9B2424"/>
           <w:sz w:val="28"/>
           <w:lang w:val="ru-RU"/>
         </w:rPr>
@@ -388,12 +429,13 @@
     </w:p>
     <w:p>
       <w:pPr>
-        <w:spacing w:after="120"/>
-      </w:pPr>
-      <w:r>
-        <w:rPr>
-          <w:rFonts w:ascii="DejaVu Sans" w:hAnsi="DejaVu Sans" w:eastAsia="DejaVu Sans" w:cs="DejaVu Sans"/>
-          <w:sz w:val="22"/>
+        <w:spacing w:before="0" w:after="140" w:line="288" w:lineRule="auto"/>
+      </w:pPr>
+      <w:r>
+        <w:rPr>
+          <w:rFonts w:ascii="Liberation Serif" w:hAnsi="Liberation Serif" w:eastAsia="Liberation Serif" w:cs="Liberation Serif"/>
+          <w:color w:val="000000"/>
+          <w:sz w:val="23"/>
           <w:lang w:val="ru-RU"/>
         </w:rPr>
         <w:t xml:space="preserve">В этой редакции нет элементов, прошедших проверку по всем трём традициям. Тексты молитв не воспроизводятся и не заменяются составительским пересказом. «Отче наш», краткие молитвенные возгласы и их языковые редакции остаются в очереди проверки, а не объявляются установленным общим минимумом.</w:t>
@@ -402,13 +444,14 @@
     <w:p>
       <w:pPr>
         <w:keepNext/>
-        <w:spacing w:after="120"/>
+        <w:spacing w:before="0" w:after="140" w:line="288" w:lineRule="auto"/>
         <w:outlineLvl w:val="0"/>
       </w:pPr>
       <w:r>
         <w:rPr>
-          <w:rFonts w:ascii="DejaVu Sans" w:hAnsi="DejaVu Sans" w:eastAsia="DejaVu Sans" w:cs="DejaVu Sans"/>
+          <w:rFonts w:ascii="Liberation Serif" w:hAnsi="Liberation Serif" w:eastAsia="Liberation Serif" w:cs="Liberation Serif"/>
           <w:b/>
+          <w:color w:val="9B2424"/>
           <w:sz w:val="28"/>
           <w:lang w:val="ru-RU"/>
         </w:rPr>
@@ -417,12 +460,13 @@
     </w:p>
     <w:p>
       <w:pPr>
-        <w:spacing w:after="120"/>
-      </w:pPr>
-      <w:r>
-        <w:rPr>
-          <w:rFonts w:ascii="DejaVu Sans" w:hAnsi="DejaVu Sans" w:eastAsia="DejaVu Sans" w:cs="DejaVu Sans"/>
-          <w:sz w:val="22"/>
+        <w:spacing w:before="0" w:after="140" w:line="288" w:lineRule="auto"/>
+      </w:pPr>
+      <w:r>
+        <w:rPr>
+          <w:rFonts w:ascii="Liberation Serif" w:hAnsi="Liberation Serif" w:eastAsia="Liberation Serif" w:cs="Liberation Serif"/>
+          <w:color w:val="000000"/>
+          <w:sz w:val="23"/>
           <w:lang w:val="ru-RU"/>
         </w:rPr>
         <w:t xml:space="preserve">Общее правило для трёх традиций пока не подтверждено непосредственно просмотренными первичными источниками. Вопросы об одежде, тишине, месте посетителя и времени входа/выхода требуют отдельного свидетельства каждой юрисдикции. Они не превращены в обязательные предписания.</w:t>
@@ -436,13 +480,14 @@
     <w:p>
       <w:pPr>
         <w:keepNext/>
-        <w:spacing w:after="120"/>
+        <w:spacing w:before="0" w:after="140" w:line="288" w:lineRule="auto"/>
         <w:outlineLvl w:val="0"/>
       </w:pPr>
       <w:r>
         <w:rPr>
-          <w:rFonts w:ascii="DejaVu Sans" w:hAnsi="DejaVu Sans" w:eastAsia="DejaVu Sans" w:cs="DejaVu Sans"/>
+          <w:rFonts w:ascii="Liberation Serif" w:hAnsi="Liberation Serif" w:eastAsia="Liberation Serif" w:cs="Liberation Serif"/>
           <w:b/>
+          <w:color w:val="9B2424"/>
           <w:sz w:val="28"/>
           <w:lang w:val="ru-RU"/>
         </w:rPr>
@@ -451,12 +496,13 @@
     </w:p>
     <w:p>
       <w:pPr>
-        <w:spacing w:after="120"/>
-      </w:pPr>
-      <w:r>
-        <w:rPr>
-          <w:rFonts w:ascii="DejaVu Sans" w:hAnsi="DejaVu Sans" w:eastAsia="DejaVu Sans" w:cs="DejaVu Sans"/>
-          <w:sz w:val="22"/>
+        <w:spacing w:before="0" w:after="140" w:line="288" w:lineRule="auto"/>
+      </w:pPr>
+      <w:r>
+        <w:rPr>
+          <w:rFonts w:ascii="Liberation Serif" w:hAnsi="Liberation Serif" w:eastAsia="Liberation Serif" w:cs="Liberation Serif"/>
+          <w:color w:val="000000"/>
+          <w:sz w:val="23"/>
           <w:lang w:val="ru-RU"/>
         </w:rPr>
         <w:t xml:space="preserve">Следующая таблица содержит только составительские переводы вопросов для дальнейшей проверки. Это не молитвы, не цитаты, не официальные церковные формулировки и не подтверждённые общие обычаи. Каждая строка передаёт один вопрос. Языковая проверка средствами ИИ не заменяет редактора — носителя языка.</w:t>
@@ -464,12 +510,13 @@
     </w:p>
     <w:p>
       <w:pPr>
-        <w:spacing w:after="120"/>
-      </w:pPr>
-      <w:r>
-        <w:rPr>
-          <w:rFonts w:ascii="DejaVu Sans" w:hAnsi="DejaVu Sans" w:eastAsia="DejaVu Sans" w:cs="DejaVu Sans"/>
-          <w:sz w:val="22"/>
+        <w:spacing w:before="0" w:after="140" w:line="288" w:lineRule="auto"/>
+      </w:pPr>
+      <w:r>
+        <w:rPr>
+          <w:rFonts w:ascii="Liberation Serif" w:hAnsi="Liberation Serif" w:eastAsia="Liberation Serif" w:cs="Liberation Serif"/>
+          <w:color w:val="000000"/>
+          <w:sz w:val="23"/>
           <w:lang w:val="ru-RU"/>
         </w:rPr>
         <w:t xml:space="preserve">Английский столбец передаёт тот же вопрос посетителя; это не перевод на армянский язык и не цитата из армянского церковного источника.</w:t>
@@ -479,14 +526,17 @@
       <w:tblPr>
         <w:tblW w:w="14400" w:type="dxa"/>
         <w:tblBorders>
-          <w:top w:val="single" w:sz="4" w:color="808080"/>
-          <w:left w:val="single" w:sz="4" w:color="808080"/>
-          <w:bottom w:val="single" w:sz="4" w:color="808080"/>
-          <w:right w:val="single" w:sz="4" w:color="808080"/>
-          <w:insideH w:val="single" w:sz="4" w:color="808080"/>
-          <w:insideV w:val="single" w:sz="4" w:color="808080"/>
+          <w:top w:val="single" w:sz="3" w:color="BBBBBB"/>
+          <w:bottom w:val="single" w:sz="3" w:color="BBBBBB"/>
+          <w:insideV w:val="single" w:sz="3" w:color="BBBBBB"/>
         </w:tblBorders>
         <w:tblLayout w:type="fixed"/>
+        <w:tblCellMar>
+          <w:top w:w="120" w:type="dxa"/>
+          <w:left w:w="120" w:type="dxa"/>
+          <w:bottom w:w="120" w:type="dxa"/>
+          <w:right w:w="120" w:type="dxa"/>
+        </w:tblCellMar>
       </w:tblPr>
       <w:tblGrid>
         <w:gridCol w:w="4800"/>
@@ -503,12 +553,14 @@
           </w:tcPr>
           <w:p>
             <w:pPr>
-              <w:spacing w:after="120"/>
-            </w:pPr>
-            <w:r>
-              <w:rPr>
-                <w:rFonts w:ascii="DejaVu Sans" w:hAnsi="DejaVu Sans" w:eastAsia="DejaVu Sans" w:cs="DejaVu Sans"/>
-                <w:sz w:val="22"/>
+              <w:spacing w:before="0" w:after="140" w:line="288" w:lineRule="auto"/>
+            </w:pPr>
+            <w:r>
+              <w:rPr>
+                <w:rFonts w:ascii="Liberation Serif" w:hAnsi="Liberation Serif" w:eastAsia="Liberation Serif" w:cs="Liberation Serif"/>
+                <w:b/>
+                <w:color w:val="9B2424"/>
+                <w:sz w:val="23"/>
                 <w:lang w:val="el-GR"/>
               </w:rPr>
               <w:t xml:space="preserve">Ελληνικά</w:t>
@@ -521,12 +573,14 @@
           </w:tcPr>
           <w:p>
             <w:pPr>
-              <w:spacing w:after="120"/>
-            </w:pPr>
-            <w:r>
-              <w:rPr>
-                <w:rFonts w:ascii="DejaVu Sans" w:hAnsi="DejaVu Sans" w:eastAsia="DejaVu Sans" w:cs="DejaVu Sans"/>
-                <w:sz w:val="22"/>
+              <w:spacing w:before="0" w:after="140" w:line="288" w:lineRule="auto"/>
+            </w:pPr>
+            <w:r>
+              <w:rPr>
+                <w:rFonts w:ascii="Liberation Serif" w:hAnsi="Liberation Serif" w:eastAsia="Liberation Serif" w:cs="Liberation Serif"/>
+                <w:b/>
+                <w:color w:val="9B2424"/>
+                <w:sz w:val="23"/>
                 <w:lang w:val="en-US"/>
               </w:rPr>
               <w:t xml:space="preserve">English</w:t>
@@ -539,12 +593,14 @@
           </w:tcPr>
           <w:p>
             <w:pPr>
-              <w:spacing w:after="120"/>
-            </w:pPr>
-            <w:r>
-              <w:rPr>
-                <w:rFonts w:ascii="DejaVu Sans" w:hAnsi="DejaVu Sans" w:eastAsia="DejaVu Sans" w:cs="DejaVu Sans"/>
-                <w:sz w:val="22"/>
+              <w:spacing w:before="0" w:after="140" w:line="288" w:lineRule="auto"/>
+            </w:pPr>
+            <w:r>
+              <w:rPr>
+                <w:rFonts w:ascii="Liberation Serif" w:hAnsi="Liberation Serif" w:eastAsia="Liberation Serif" w:cs="Liberation Serif"/>
+                <w:b/>
+                <w:color w:val="9B2424"/>
+                <w:sz w:val="23"/>
                 <w:lang w:val="bg-BG"/>
               </w:rPr>
               <w:t xml:space="preserve">Български</w:t>
@@ -559,12 +615,13 @@
           </w:tcPr>
           <w:p>
             <w:pPr>
-              <w:spacing w:after="120"/>
-            </w:pPr>
-            <w:r>
-              <w:rPr>
-                <w:rFonts w:ascii="DejaVu Sans" w:hAnsi="DejaVu Sans" w:eastAsia="DejaVu Sans" w:cs="DejaVu Sans"/>
-                <w:sz w:val="22"/>
+              <w:spacing w:before="0" w:after="140" w:line="288" w:lineRule="auto"/>
+            </w:pPr>
+            <w:r>
+              <w:rPr>
+                <w:rFonts w:ascii="Liberation Serif" w:hAnsi="Liberation Serif" w:eastAsia="Liberation Serif" w:cs="Liberation Serif"/>
+                <w:color w:val="000000"/>
+                <w:sz w:val="23"/>
                 <w:lang w:val="el-GR"/>
               </w:rPr>
               <w:t xml:space="preserve">Μπορώ να μπω τώρα χωρίς να ενοχλήσω την ακολουθία;</w:t>
@@ -577,12 +634,13 @@
           </w:tcPr>
           <w:p>
             <w:pPr>
-              <w:spacing w:after="120"/>
-            </w:pPr>
-            <w:r>
-              <w:rPr>
-                <w:rFonts w:ascii="DejaVu Sans" w:hAnsi="DejaVu Sans" w:eastAsia="DejaVu Sans" w:cs="DejaVu Sans"/>
-                <w:sz w:val="22"/>
+              <w:spacing w:before="0" w:after="140" w:line="288" w:lineRule="auto"/>
+            </w:pPr>
+            <w:r>
+              <w:rPr>
+                <w:rFonts w:ascii="Liberation Serif" w:hAnsi="Liberation Serif" w:eastAsia="Liberation Serif" w:cs="Liberation Serif"/>
+                <w:color w:val="000000"/>
+                <w:sz w:val="23"/>
                 <w:lang w:val="en-US"/>
               </w:rPr>
               <w:t xml:space="preserve">May I enter now without disturbing the service?</w:t>
@@ -595,12 +653,13 @@
           </w:tcPr>
           <w:p>
             <w:pPr>
-              <w:spacing w:after="120"/>
-            </w:pPr>
-            <w:r>
-              <w:rPr>
-                <w:rFonts w:ascii="DejaVu Sans" w:hAnsi="DejaVu Sans" w:eastAsia="DejaVu Sans" w:cs="DejaVu Sans"/>
-                <w:sz w:val="22"/>
+              <w:spacing w:before="0" w:after="140" w:line="288" w:lineRule="auto"/>
+            </w:pPr>
+            <w:r>
+              <w:rPr>
+                <w:rFonts w:ascii="Liberation Serif" w:hAnsi="Liberation Serif" w:eastAsia="Liberation Serif" w:cs="Liberation Serif"/>
+                <w:color w:val="000000"/>
+                <w:sz w:val="23"/>
                 <w:lang w:val="bg-BG"/>
               </w:rPr>
               <w:t xml:space="preserve">Мога ли да вляза сега, без да преча на богослужението?</w:t>
@@ -615,12 +674,13 @@
           </w:tcPr>
           <w:p>
             <w:pPr>
-              <w:spacing w:after="120"/>
-            </w:pPr>
-            <w:r>
-              <w:rPr>
-                <w:rFonts w:ascii="DejaVu Sans" w:hAnsi="DejaVu Sans" w:eastAsia="DejaVu Sans" w:cs="DejaVu Sans"/>
-                <w:sz w:val="22"/>
+              <w:spacing w:before="0" w:after="140" w:line="288" w:lineRule="auto"/>
+            </w:pPr>
+            <w:r>
+              <w:rPr>
+                <w:rFonts w:ascii="Liberation Serif" w:hAnsi="Liberation Serif" w:eastAsia="Liberation Serif" w:cs="Liberation Serif"/>
+                <w:color w:val="000000"/>
+                <w:sz w:val="23"/>
                 <w:lang w:val="el-GR"/>
               </w:rPr>
               <w:t xml:space="preserve">Πού μπορώ να σταθώ;</w:t>
@@ -633,12 +693,13 @@
           </w:tcPr>
           <w:p>
             <w:pPr>
-              <w:spacing w:after="120"/>
-            </w:pPr>
-            <w:r>
-              <w:rPr>
-                <w:rFonts w:ascii="DejaVu Sans" w:hAnsi="DejaVu Sans" w:eastAsia="DejaVu Sans" w:cs="DejaVu Sans"/>
-                <w:sz w:val="22"/>
+              <w:spacing w:before="0" w:after="140" w:line="288" w:lineRule="auto"/>
+            </w:pPr>
+            <w:r>
+              <w:rPr>
+                <w:rFonts w:ascii="Liberation Serif" w:hAnsi="Liberation Serif" w:eastAsia="Liberation Serif" w:cs="Liberation Serif"/>
+                <w:color w:val="000000"/>
+                <w:sz w:val="23"/>
                 <w:lang w:val="en-US"/>
               </w:rPr>
               <w:t xml:space="preserve">Where may I stand?</w:t>
@@ -651,12 +712,13 @@
           </w:tcPr>
           <w:p>
             <w:pPr>
-              <w:spacing w:after="120"/>
-            </w:pPr>
-            <w:r>
-              <w:rPr>
-                <w:rFonts w:ascii="DejaVu Sans" w:hAnsi="DejaVu Sans" w:eastAsia="DejaVu Sans" w:cs="DejaVu Sans"/>
-                <w:sz w:val="22"/>
+              <w:spacing w:before="0" w:after="140" w:line="288" w:lineRule="auto"/>
+            </w:pPr>
+            <w:r>
+              <w:rPr>
+                <w:rFonts w:ascii="Liberation Serif" w:hAnsi="Liberation Serif" w:eastAsia="Liberation Serif" w:cs="Liberation Serif"/>
+                <w:color w:val="000000"/>
+                <w:sz w:val="23"/>
                 <w:lang w:val="bg-BG"/>
               </w:rPr>
               <w:t xml:space="preserve">Къде мога да застана?</w:t>
@@ -671,12 +733,13 @@
           </w:tcPr>
           <w:p>
             <w:pPr>
-              <w:spacing w:after="120"/>
-            </w:pPr>
-            <w:r>
-              <w:rPr>
-                <w:rFonts w:ascii="DejaVu Sans" w:hAnsi="DejaVu Sans" w:eastAsia="DejaVu Sans" w:cs="DejaVu Sans"/>
-                <w:sz w:val="22"/>
+              <w:spacing w:before="0" w:after="140" w:line="288" w:lineRule="auto"/>
+            </w:pPr>
+            <w:r>
+              <w:rPr>
+                <w:rFonts w:ascii="Liberation Serif" w:hAnsi="Liberation Serif" w:eastAsia="Liberation Serif" w:cs="Liberation Serif"/>
+                <w:color w:val="000000"/>
+                <w:sz w:val="23"/>
                 <w:lang w:val="el-GR"/>
               </w:rPr>
               <w:t xml:space="preserve">Ποιο κείμενο προσευχής χρησιμοποιείται σε αυτή την κοινότητα;</w:t>
@@ -689,12 +752,13 @@
           </w:tcPr>
           <w:p>
             <w:pPr>
-              <w:spacing w:after="120"/>
-            </w:pPr>
-            <w:r>
-              <w:rPr>
-                <w:rFonts w:ascii="DejaVu Sans" w:hAnsi="DejaVu Sans" w:eastAsia="DejaVu Sans" w:cs="DejaVu Sans"/>
-                <w:sz w:val="22"/>
+              <w:spacing w:before="0" w:after="140" w:line="288" w:lineRule="auto"/>
+            </w:pPr>
+            <w:r>
+              <w:rPr>
+                <w:rFonts w:ascii="Liberation Serif" w:hAnsi="Liberation Serif" w:eastAsia="Liberation Serif" w:cs="Liberation Serif"/>
+                <w:color w:val="000000"/>
+                <w:sz w:val="23"/>
                 <w:lang w:val="en-US"/>
               </w:rPr>
               <w:t xml:space="preserve">Which prayer text is used in this community?</w:t>
@@ -707,12 +771,13 @@
           </w:tcPr>
           <w:p>
             <w:pPr>
-              <w:spacing w:after="120"/>
-            </w:pPr>
-            <w:r>
-              <w:rPr>
-                <w:rFonts w:ascii="DejaVu Sans" w:hAnsi="DejaVu Sans" w:eastAsia="DejaVu Sans" w:cs="DejaVu Sans"/>
-                <w:sz w:val="22"/>
+              <w:spacing w:before="0" w:after="140" w:line="288" w:lineRule="auto"/>
+            </w:pPr>
+            <w:r>
+              <w:rPr>
+                <w:rFonts w:ascii="Liberation Serif" w:hAnsi="Liberation Serif" w:eastAsia="Liberation Serif" w:cs="Liberation Serif"/>
+                <w:color w:val="000000"/>
+                <w:sz w:val="23"/>
                 <w:lang w:val="bg-BG"/>
               </w:rPr>
               <w:t xml:space="preserve">Кой молитвен текст се използва в тази общност?</w:t>
@@ -727,12 +792,13 @@
           </w:tcPr>
           <w:p>
             <w:pPr>
-              <w:spacing w:after="120"/>
-            </w:pPr>
-            <w:r>
-              <w:rPr>
-                <w:rFonts w:ascii="DejaVu Sans" w:hAnsi="DejaVu Sans" w:eastAsia="DejaVu Sans" w:cs="DejaVu Sans"/>
-                <w:sz w:val="22"/>
+              <w:spacing w:before="0" w:after="140" w:line="288" w:lineRule="auto"/>
+            </w:pPr>
+            <w:r>
+              <w:rPr>
+                <w:rFonts w:ascii="Liberation Serif" w:hAnsi="Liberation Serif" w:eastAsia="Liberation Serif" w:cs="Liberation Serif"/>
+                <w:color w:val="000000"/>
+                <w:sz w:val="23"/>
                 <w:lang w:val="el-GR"/>
               </w:rPr>
               <w:t xml:space="preserve">Πότε μπορώ να φύγω χωρίς να ενοχλήσω τους άλλους;</w:t>
@@ -745,12 +811,13 @@
           </w:tcPr>
           <w:p>
             <w:pPr>
-              <w:spacing w:after="120"/>
-            </w:pPr>
-            <w:r>
-              <w:rPr>
-                <w:rFonts w:ascii="DejaVu Sans" w:hAnsi="DejaVu Sans" w:eastAsia="DejaVu Sans" w:cs="DejaVu Sans"/>
-                <w:sz w:val="22"/>
+              <w:spacing w:before="0" w:after="140" w:line="288" w:lineRule="auto"/>
+            </w:pPr>
+            <w:r>
+              <w:rPr>
+                <w:rFonts w:ascii="Liberation Serif" w:hAnsi="Liberation Serif" w:eastAsia="Liberation Serif" w:cs="Liberation Serif"/>
+                <w:color w:val="000000"/>
+                <w:sz w:val="23"/>
                 <w:lang w:val="en-US"/>
               </w:rPr>
               <w:t xml:space="preserve">When may I leave without disturbing others?</w:t>
@@ -763,12 +830,13 @@
           </w:tcPr>
           <w:p>
             <w:pPr>
-              <w:spacing w:after="120"/>
-            </w:pPr>
-            <w:r>
-              <w:rPr>
-                <w:rFonts w:ascii="DejaVu Sans" w:hAnsi="DejaVu Sans" w:eastAsia="DejaVu Sans" w:cs="DejaVu Sans"/>
-                <w:sz w:val="22"/>
+              <w:spacing w:before="0" w:after="140" w:line="288" w:lineRule="auto"/>
+            </w:pPr>
+            <w:r>
+              <w:rPr>
+                <w:rFonts w:ascii="Liberation Serif" w:hAnsi="Liberation Serif" w:eastAsia="Liberation Serif" w:cs="Liberation Serif"/>
+                <w:color w:val="000000"/>
+                <w:sz w:val="23"/>
                 <w:lang w:val="bg-BG"/>
               </w:rPr>
               <w:t xml:space="preserve">Кога мога да си тръгна, без да преча на другите?</w:t>
@@ -780,13 +848,14 @@
     <w:p>
       <w:pPr>
         <w:keepNext/>
-        <w:spacing w:after="120"/>
+        <w:spacing w:before="0" w:after="140" w:line="288" w:lineRule="auto"/>
         <w:outlineLvl w:val="0"/>
       </w:pPr>
       <w:r>
         <w:rPr>
-          <w:rFonts w:ascii="DejaVu Sans" w:hAnsi="DejaVu Sans" w:eastAsia="DejaVu Sans" w:cs="DejaVu Sans"/>
+          <w:rFonts w:ascii="Liberation Serif" w:hAnsi="Liberation Serif" w:eastAsia="Liberation Serif" w:cs="Liberation Serif"/>
           <w:b/>
+          <w:color w:val="9B2424"/>
           <w:sz w:val="28"/>
           <w:lang w:val="ru-RU"/>
         </w:rPr>
@@ -795,12 +864,13 @@
     </w:p>
     <w:p>
       <w:pPr>
-        <w:spacing w:after="120"/>
-      </w:pPr>
-      <w:r>
-        <w:rPr>
-          <w:rFonts w:ascii="DejaVu Sans" w:hAnsi="DejaVu Sans" w:eastAsia="DejaVu Sans" w:cs="DejaVu Sans"/>
-          <w:sz w:val="22"/>
+        <w:spacing w:before="0" w:after="140" w:line="288" w:lineRule="auto"/>
+      </w:pPr>
+      <w:r>
+        <w:rPr>
+          <w:rFonts w:ascii="Liberation Serif" w:hAnsi="Liberation Serif" w:eastAsia="Liberation Serif" w:cs="Liberation Serif"/>
+          <w:color w:val="000000"/>
+          <w:sz w:val="23"/>
           <w:lang w:val="ru-RU"/>
         </w:rPr>
         <w:t xml:space="preserve">Источник греческой православной традиции вне Кипра не устанавливает местную кипрскую практику. Английская редакция армянского молитвенника не подтверждает употребление её формулировок в двух других церквах. Печатный болгарский молитвенник и сетевые главы нельзя считать разными книгами без доказательства самостоятельности изданий.</w:t>
@@ -808,12 +878,13 @@
     </w:p>
     <w:p>
       <w:pPr>
-        <w:spacing w:after="120"/>
-      </w:pPr>
-      <w:r>
-        <w:rPr>
-          <w:rFonts w:ascii="DejaVu Sans" w:hAnsi="DejaVu Sans" w:eastAsia="DejaVu Sans" w:cs="DejaVu Sans"/>
-          <w:sz w:val="22"/>
+        <w:spacing w:before="0" w:after="140" w:line="288" w:lineRule="auto"/>
+      </w:pPr>
+      <w:r>
+        <w:rPr>
+          <w:rFonts w:ascii="Liberation Serif" w:hAnsi="Liberation Serif" w:eastAsia="Liberation Serif" w:cs="Liberation Serif"/>
+          <w:color w:val="000000"/>
+          <w:sz w:val="23"/>
           <w:lang w:val="ru-RU"/>
         </w:rPr>
         <w:t xml:space="preserve">В следующей редакции нужно отдельно сопоставить обращения, окончания молитв, роль священнослужителя и мирянина, а также контекст личной молитвы и общей службы. Пока такие различия не проверены, они не заполнены догадками.</w:t>
@@ -822,13 +893,14 @@
     <w:p>
       <w:pPr>
         <w:keepNext/>
-        <w:spacing w:after="120"/>
+        <w:spacing w:before="0" w:after="140" w:line="288" w:lineRule="auto"/>
         <w:outlineLvl w:val="0"/>
       </w:pPr>
       <w:r>
         <w:rPr>
-          <w:rFonts w:ascii="DejaVu Sans" w:hAnsi="DejaVu Sans" w:eastAsia="DejaVu Sans" w:cs="DejaVu Sans"/>
+          <w:rFonts w:ascii="Liberation Serif" w:hAnsi="Liberation Serif" w:eastAsia="Liberation Serif" w:cs="Liberation Serif"/>
           <w:b/>
+          <w:color w:val="9B2424"/>
           <w:sz w:val="28"/>
           <w:lang w:val="ru-RU"/>
         </w:rPr>
@@ -837,12 +909,13 @@
     </w:p>
     <w:p>
       <w:pPr>
-        <w:spacing w:after="120"/>
-      </w:pPr>
-      <w:r>
-        <w:rPr>
-          <w:rFonts w:ascii="DejaVu Sans" w:hAnsi="DejaVu Sans" w:eastAsia="DejaVu Sans" w:cs="DejaVu Sans"/>
-          <w:sz w:val="22"/>
+        <w:spacing w:before="0" w:after="140" w:line="288" w:lineRule="auto"/>
+      </w:pPr>
+      <w:r>
+        <w:rPr>
+          <w:rFonts w:ascii="Liberation Serif" w:hAnsi="Liberation Serif" w:eastAsia="Liberation Serif" w:cs="Liberation Serif"/>
+          <w:color w:val="000000"/>
+          <w:sz w:val="23"/>
           <w:lang w:val="ru-RU"/>
         </w:rPr>
         <w:t xml:space="preserve">Ниже — направления проверки, а не доказательная база готового пересечения. Их статус, библиография и права отмечаются в отдельном каталоге и манифесте.</w:t>
@@ -850,12 +923,13 @@
     </w:p>
     <w:p>
       <w:pPr>
-        <w:spacing w:after="120"/>
-      </w:pPr>
-      <w:r>
-        <w:rPr>
-          <w:rFonts w:ascii="DejaVu Sans" w:hAnsi="DejaVu Sans" w:eastAsia="DejaVu Sans" w:cs="DejaVu Sans"/>
-          <w:sz w:val="22"/>
+        <w:spacing w:before="0" w:after="140" w:line="288" w:lineRule="auto"/>
+      </w:pPr>
+      <w:r>
+        <w:rPr>
+          <w:rFonts w:ascii="Liberation Serif" w:hAnsi="Liberation Serif" w:eastAsia="Liberation Serif" w:cs="Liberation Serif"/>
+          <w:color w:val="000000"/>
+          <w:sz w:val="23"/>
           <w:lang w:val="ru-RU"/>
         </w:rPr>
         <w:t xml:space="preserve">Церковь Кипра, «Προσευχητάριο: Πρωϊνή προσευχή»: </w:t>
@@ -863,8 +937,10 @@
       <w:hyperlink r:id="url1">
         <w:r>
           <w:rPr>
-            <w:rFonts w:ascii="DejaVu Sans" w:hAnsi="DejaVu Sans" w:eastAsia="DejaVu Sans" w:cs="DejaVu Sans"/>
-            <w:sz w:val="22"/>
+            <w:rFonts w:ascii="Liberation Serif" w:hAnsi="Liberation Serif" w:eastAsia="Liberation Serif" w:cs="Liberation Serif"/>
+            <w:color w:val="000000"/>
+            <w:sz w:val="23"/>
+            <w:u w:val="single"/>
             <w:lang w:val="ru-RU"/>
           </w:rPr>
           <w:t xml:space="preserve">https://churchofcyprus.org.cy/8571</w:t>
@@ -873,12 +949,13 @@
     </w:p>
     <w:p>
       <w:pPr>
-        <w:spacing w:after="120"/>
-      </w:pPr>
-      <w:r>
-        <w:rPr>
-          <w:rFonts w:ascii="DejaVu Sans" w:hAnsi="DejaVu Sans" w:eastAsia="DejaVu Sans" w:cs="DejaVu Sans"/>
-          <w:sz w:val="22"/>
+        <w:spacing w:before="0" w:after="140" w:line="288" w:lineRule="auto"/>
+      </w:pPr>
+      <w:r>
+        <w:rPr>
+          <w:rFonts w:ascii="Liberation Serif" w:hAnsi="Liberation Serif" w:eastAsia="Liberation Serif" w:cs="Liberation Serif"/>
+          <w:color w:val="000000"/>
+          <w:sz w:val="23"/>
           <w:lang w:val="ru-RU"/>
         </w:rPr>
         <w:t xml:space="preserve">Митрополия Тримифунта, кандидат «Προσευχητάριον»; PDF и выходные данные не просмотрены: </w:t>
@@ -886,8 +963,10 @@
       <w:hyperlink r:id="url2">
         <w:r>
           <w:rPr>
-            <w:rFonts w:ascii="DejaVu Sans" w:hAnsi="DejaVu Sans" w:eastAsia="DejaVu Sans" w:cs="DejaVu Sans"/>
-            <w:sz w:val="22"/>
+            <w:rFonts w:ascii="Liberation Serif" w:hAnsi="Liberation Serif" w:eastAsia="Liberation Serif" w:cs="Liberation Serif"/>
+            <w:color w:val="000000"/>
+            <w:sz w:val="23"/>
+            <w:u w:val="single"/>
             <w:lang w:val="ru-RU"/>
           </w:rPr>
           <w:t xml:space="preserve">https://imtrimythountos.org.cy/prosefxitarion/</w:t>
@@ -896,12 +975,13 @@
     </w:p>
     <w:p>
       <w:pPr>
-        <w:spacing w:after="120"/>
-      </w:pPr>
-      <w:r>
-        <w:rPr>
-          <w:rFonts w:ascii="DejaVu Sans" w:hAnsi="DejaVu Sans" w:eastAsia="DejaVu Sans" w:cs="DejaVu Sans"/>
-          <w:sz w:val="22"/>
+        <w:spacing w:before="0" w:after="140" w:line="288" w:lineRule="auto"/>
+      </w:pPr>
+      <w:r>
+        <w:rPr>
+          <w:rFonts w:ascii="Liberation Serif" w:hAnsi="Liberation Serif" w:eastAsia="Liberation Serif" w:cs="Liberation Serif"/>
+          <w:color w:val="000000"/>
+          <w:sz w:val="23"/>
           <w:lang w:val="ru-RU"/>
         </w:rPr>
         <w:t xml:space="preserve">Церковь Кипра, направление поиска статьи о входе в храм; советы не проверены: </w:t>
@@ -909,8 +989,10 @@
       <w:hyperlink r:id="url3">
         <w:r>
           <w:rPr>
-            <w:rFonts w:ascii="DejaVu Sans" w:hAnsi="DejaVu Sans" w:eastAsia="DejaVu Sans" w:cs="DejaVu Sans"/>
-            <w:sz w:val="22"/>
+            <w:rFonts w:ascii="Liberation Serif" w:hAnsi="Liberation Serif" w:eastAsia="Liberation Serif" w:cs="Liberation Serif"/>
+            <w:color w:val="000000"/>
+            <w:sz w:val="23"/>
+            <w:u w:val="single"/>
             <w:lang w:val="ru-RU"/>
           </w:rPr>
           <w:t xml:space="preserve">https://churchofcyprus.org.cy/8418</w:t>
@@ -919,12 +1001,13 @@
     </w:p>
     <w:p>
       <w:pPr>
-        <w:spacing w:after="120"/>
-      </w:pPr>
-      <w:r>
-        <w:rPr>
-          <w:rFonts w:ascii="DejaVu Sans" w:hAnsi="DejaVu Sans" w:eastAsia="DejaVu Sans" w:cs="DejaVu Sans"/>
-          <w:sz w:val="22"/>
+        <w:spacing w:before="0" w:after="140" w:line="288" w:lineRule="auto"/>
+      </w:pPr>
+      <w:r>
+        <w:rPr>
+          <w:rFonts w:ascii="Liberation Serif" w:hAnsi="Liberation Serif" w:eastAsia="Liberation Serif" w:cs="Liberation Serif"/>
+          <w:color w:val="000000"/>
+          <w:sz w:val="23"/>
           <w:lang w:val="ru-RU"/>
         </w:rPr>
         <w:t xml:space="preserve">Болгарская патриархия, каталог молитвенника: </w:t>
@@ -932,8 +1015,10 @@
       <w:hyperlink r:id="url4">
         <w:r>
           <w:rPr>
-            <w:rFonts w:ascii="DejaVu Sans" w:hAnsi="DejaVu Sans" w:eastAsia="DejaVu Sans" w:cs="DejaVu Sans"/>
-            <w:sz w:val="22"/>
+            <w:rFonts w:ascii="Liberation Serif" w:hAnsi="Liberation Serif" w:eastAsia="Liberation Serif" w:cs="Liberation Serif"/>
+            <w:color w:val="000000"/>
+            <w:sz w:val="23"/>
+            <w:u w:val="single"/>
             <w:lang w:val="ru-RU"/>
           </w:rPr>
           <w:t xml:space="preserve">https://bg-patriarshia.bg/bookshop-books/molitvenik</w:t>
@@ -942,12 +1027,13 @@
     </w:p>
     <w:p>
       <w:pPr>
-        <w:spacing w:after="120"/>
-      </w:pPr>
-      <w:r>
-        <w:rPr>
-          <w:rFonts w:ascii="DejaVu Sans" w:hAnsi="DejaVu Sans" w:eastAsia="DejaVu Sans" w:cs="DejaVu Sans"/>
-          <w:sz w:val="22"/>
+        <w:spacing w:before="0" w:after="140" w:line="288" w:lineRule="auto"/>
+      </w:pPr>
+      <w:r>
+        <w:rPr>
+          <w:rFonts w:ascii="Liberation Serif" w:hAnsi="Liberation Serif" w:eastAsia="Liberation Serif" w:cs="Liberation Serif"/>
+          <w:color w:val="000000"/>
+          <w:sz w:val="23"/>
           <w:lang w:val="ru-RU"/>
         </w:rPr>
         <w:t xml:space="preserve">Болгарская патриархия, сетевые молитвенные разделы: </w:t>
@@ -955,8 +1041,10 @@
       <w:hyperlink r:id="url5">
         <w:r>
           <w:rPr>
-            <w:rFonts w:ascii="DejaVu Sans" w:hAnsi="DejaVu Sans" w:eastAsia="DejaVu Sans" w:cs="DejaVu Sans"/>
-            <w:sz w:val="22"/>
+            <w:rFonts w:ascii="Liberation Serif" w:hAnsi="Liberation Serif" w:eastAsia="Liberation Serif" w:cs="Liberation Serif"/>
+            <w:color w:val="000000"/>
+            <w:sz w:val="23"/>
+            <w:u w:val="single"/>
             <w:lang w:val="ru-RU"/>
           </w:rPr>
           <w:t xml:space="preserve">https://bg-patriarshia.bg/liturgical-prayer</w:t>
@@ -965,12 +1053,13 @@
     </w:p>
     <w:p>
       <w:pPr>
-        <w:spacing w:after="120"/>
-      </w:pPr>
-      <w:r>
-        <w:rPr>
-          <w:rFonts w:ascii="DejaVu Sans" w:hAnsi="DejaVu Sans" w:eastAsia="DejaVu Sans" w:cs="DejaVu Sans"/>
-          <w:sz w:val="22"/>
+        <w:spacing w:before="0" w:after="140" w:line="288" w:lineRule="auto"/>
+      </w:pPr>
+      <w:r>
+        <w:rPr>
+          <w:rFonts w:ascii="Liberation Serif" w:hAnsi="Liberation Serif" w:eastAsia="Liberation Serif" w:cs="Liberation Serif"/>
+          <w:color w:val="000000"/>
+          <w:sz w:val="23"/>
           <w:lang w:val="ru-RU"/>
         </w:rPr>
         <w:t xml:space="preserve">Armenian Prelacy, объявление издания «In Faith I Confess»: </w:t>
@@ -978,8 +1067,10 @@
       <w:hyperlink r:id="url6">
         <w:r>
           <w:rPr>
-            <w:rFonts w:ascii="DejaVu Sans" w:hAnsi="DejaVu Sans" w:eastAsia="DejaVu Sans" w:cs="DejaVu Sans"/>
-            <w:sz w:val="22"/>
+            <w:rFonts w:ascii="Liberation Serif" w:hAnsi="Liberation Serif" w:eastAsia="Liberation Serif" w:cs="Liberation Serif"/>
+            <w:color w:val="000000"/>
+            <w:sz w:val="23"/>
+            <w:u w:val="single"/>
             <w:lang w:val="ru-RU"/>
           </w:rPr>
           <w:t xml:space="preserve">https://armenianprelacy.org/2022/06/16/new-edition-of-st-nerses-shnorhalis-in-faith-i-confess/</w:t>
@@ -988,12 +1079,13 @@
     </w:p>
     <w:p>
       <w:pPr>
-        <w:spacing w:after="120"/>
-      </w:pPr>
-      <w:r>
-        <w:rPr>
-          <w:rFonts w:ascii="DejaVu Sans" w:hAnsi="DejaVu Sans" w:eastAsia="DejaVu Sans" w:cs="DejaVu Sans"/>
-          <w:sz w:val="22"/>
+        <w:spacing w:before="0" w:after="140" w:line="288" w:lineRule="auto"/>
+      </w:pPr>
+      <w:r>
+        <w:rPr>
+          <w:rFonts w:ascii="Liberation Serif" w:hAnsi="Liberation Serif" w:eastAsia="Liberation Serif" w:cs="Liberation Serif"/>
+          <w:color w:val="000000"/>
+          <w:sz w:val="23"/>
           <w:lang w:val="ru-RU"/>
         </w:rPr>
         <w:t xml:space="preserve">Vemkar, направление проверки брошюры об этикете: </w:t>
@@ -1001,8 +1093,10 @@
       <w:hyperlink r:id="url7">
         <w:r>
           <w:rPr>
-            <w:rFonts w:ascii="DejaVu Sans" w:hAnsi="DejaVu Sans" w:eastAsia="DejaVu Sans" w:cs="DejaVu Sans"/>
-            <w:sz w:val="22"/>
+            <w:rFonts w:ascii="Liberation Serif" w:hAnsi="Liberation Serif" w:eastAsia="Liberation Serif" w:cs="Liberation Serif"/>
+            <w:color w:val="000000"/>
+            <w:sz w:val="23"/>
+            <w:u w:val="single"/>
             <w:lang w:val="ru-RU"/>
           </w:rPr>
           <w:t xml:space="preserve">https://vemkar.us/wp-content/uploads/2025/01/VTS-Church-Etiquette-WEB.pdf</w:t>
@@ -1012,13 +1106,14 @@
     <w:p>
       <w:pPr>
         <w:keepNext/>
-        <w:spacing w:after="120"/>
+        <w:spacing w:before="0" w:after="140" w:line="288" w:lineRule="auto"/>
         <w:outlineLvl w:val="0"/>
       </w:pPr>
       <w:r>
         <w:rPr>
-          <w:rFonts w:ascii="DejaVu Sans" w:hAnsi="DejaVu Sans" w:eastAsia="DejaVu Sans" w:cs="DejaVu Sans"/>
+          <w:rFonts w:ascii="Liberation Serif" w:hAnsi="Liberation Serif" w:eastAsia="Liberation Serif" w:cs="Liberation Serif"/>
           <w:b/>
+          <w:color w:val="9B2424"/>
           <w:sz w:val="28"/>
           <w:lang w:val="ru-RU"/>
         </w:rPr>
@@ -1027,12 +1122,13 @@
     </w:p>
     <w:p>
       <w:pPr>
-        <w:spacing w:after="120"/>
-      </w:pPr>
-      <w:r>
-        <w:rPr>
-          <w:rFonts w:ascii="DejaVu Sans" w:hAnsi="DejaVu Sans" w:eastAsia="DejaVu Sans" w:cs="DejaVu Sans"/>
-          <w:sz w:val="22"/>
+        <w:spacing w:before="0" w:after="140" w:line="288" w:lineRule="auto"/>
+      </w:pPr>
+      <w:r>
+        <w:rPr>
+          <w:rFonts w:ascii="Liberation Serif" w:hAnsi="Liberation Serif" w:eastAsia="Liberation Serif" w:cs="Liberation Serif"/>
+          <w:color w:val="000000"/>
+          <w:sz w:val="23"/>
           <w:lang w:val="ru-RU"/>
         </w:rPr>
         <w:t xml:space="preserve">Дата исследования: 18 октября 2026 года. В терминале GitHub доступен, а проверенные церковные домены возвращают ошибку DNS. Встроенный поиск даёт ссылки и выдержки, но прямой просмотр первичных страниц ограничен. Браузерный инструмент недоступен из-за ошибки транспорта. Это не основание объявлять сайты недоступными для всех.</w:t>
@@ -1040,12 +1136,13 @@
     </w:p>
     <w:p>
       <w:pPr>
-        <w:spacing w:after="120"/>
-      </w:pPr>
-      <w:r>
-        <w:rPr>
-          <w:rFonts w:ascii="DejaVu Sans" w:hAnsi="DejaVu Sans" w:eastAsia="DejaVu Sans" w:cs="DejaVu Sans"/>
-          <w:sz w:val="22"/>
+        <w:spacing w:before="0" w:after="140" w:line="288" w:lineRule="auto"/>
+      </w:pPr>
+      <w:r>
+        <w:rPr>
+          <w:rFonts w:ascii="Liberation Serif" w:hAnsi="Liberation Serif" w:eastAsia="Liberation Serif" w:cs="Liberation Serif"/>
+          <w:color w:val="000000"/>
+          <w:sz w:val="23"/>
           <w:lang w:val="ru-RU"/>
         </w:rPr>
         <w:t xml:space="preserve">Никакие полные сторонние книги или современные переводы молитв в этот макет не импортированы. Составительские вопросы в таблице не считаются преобразованной книгой. Внешнее рецензирование, благословение и профессиональная языковая редактура носителями соответствующих языков не заявляются. Независимые проверки ИИ и решения редакции фиксируются в editorial-review.md.</w:t>
@@ -1053,15 +1150,30 @@
     </w:p>
     <w:p>
       <w:pPr>
-        <w:spacing w:after="120"/>
-      </w:pPr>
-      <w:r>
-        <w:rPr>
-          <w:rFonts w:ascii="DejaVu Sans" w:hAnsi="DejaVu Sans" w:eastAsia="DejaVu Sans" w:cs="DejaVu Sans"/>
-          <w:sz w:val="22"/>
+        <w:spacing w:before="0" w:after="140" w:line="288" w:lineRule="auto"/>
+      </w:pPr>
+      <w:r>
+        <w:rPr>
+          <w:rFonts w:ascii="Liberation Serif" w:hAnsi="Liberation Serif" w:eastAsia="Liberation Serif" w:cs="Liberation Serif"/>
+          <w:color w:val="000000"/>
+          <w:sz w:val="23"/>
           <w:lang w:val="ru-RU"/>
         </w:rPr>
         <w:t xml:space="preserve">DOCX собран стандартной библиотекой Python. Проверяются непустой ZIP, XML, word/document.xml, сохранность текста, три равные ячейки, повтор заголовка и поле номера страницы. Визуальный просмотр в Word или другом рендерере не выполнен; переносы страниц и отсутствие визуальных дефектов требуют проверки человеком.</w:t>
+      </w:r>
+    </w:p>
+    <w:p>
+      <w:pPr>
+        <w:spacing w:before="0" w:after="140" w:line="288" w:lineRule="auto"/>
+      </w:pPr>
+      <w:r>
+        <w:rPr>
+          <w:rFonts w:ascii="Liberation Serif" w:hAnsi="Liberation Serif" w:eastAsia="Liberation Serif" w:cs="Liberation Serif"/>
+          <w:color w:val="000000"/>
+          <w:sz w:val="23"/>
+          <w:lang w:val="ru-RU"/>
+        </w:rPr>
+        <w:t xml:space="preserve">После обновления задания этот исторический макет сохранён; текущая цель — пять авторских руководств. Новая спецификация и статусы находятся в current-task.md и books/manifest.json. Оформление обновлено по design-spec.md: Liberation Serif, чёрный текст и тёмно-красные рубрики. Само изменение дизайна не подтверждает молитвы или правила.</w:t>
       </w:r>
     </w:p>
     <w:sectPr>
@@ -1079,7 +1191,15 @@
     <w:pPr>
       <w:jc w:val="center"/>
     </w:pPr>
-    <w:fldSimple w:instr="PAGE"/>
+    <w:fldSimple w:instr="PAGE">
+      <w:r>
+        <w:rPr>
+          <w:rFonts w:ascii="Liberation Serif" w:hAnsi="Liberation Serif"/>
+          <w:sz w:val="20"/>
+          <w:lang w:val="ru-RU"/>
+        </w:rPr>
+      </w:r>
+    </w:fldSimple>
   </w:p>
 </w:ftr>
 </file>
</xml_diff>